<commit_message>
Fix Roads mapping: use Roads export file and include Requested column
Roads is the wide export (not the GSF utilization rollup).
Map Roads Requested → Onyx Total Staff Requested → Master Required.
Update the Word guide to match.

Co-authored-by: echenry6f <echenry6f@users.noreply.github.com>
</commit_message>
<xml_diff>
--- a/Roads_Onyx_Master_Crosswalk_Guide.docx
+++ b/Roads_Onyx_Master_Crosswalk_Guide.docx
@@ -3,10 +3,6 @@
 <w:document xmlns:wpc="http://schemas.microsoft.com/office/word/2010/wordprocessingCanvas" xmlns:mo="http://schemas.microsoft.com/office/mac/office/2008/main" xmlns:mc="http://schemas.openxmlformats.org/markup-compatibility/2006" xmlns:mv="urn:schemas-microsoft-com:mac:vml" xmlns:o="urn:schemas-microsoft-com:office:office" xmlns:r="http://schemas.openxmlformats.org/officeDocument/2006/relationships" xmlns:m="http://schemas.openxmlformats.org/officeDocument/2006/math" xmlns:v="urn:schemas-microsoft-com:vml" xmlns:wp14="http://schemas.microsoft.com/office/word/2010/wordprocessingDrawing" xmlns:wp="http://schemas.openxmlformats.org/drawingml/2006/wordprocessingDrawing" xmlns:w10="urn:schemas-microsoft-com:office:word" xmlns:w="http://schemas.openxmlformats.org/wordprocessingml/2006/main" xmlns:w14="http://schemas.microsoft.com/office/word/2010/wordml" xmlns:wpg="http://schemas.microsoft.com/office/word/2010/wordprocessingGroup" xmlns:wpi="http://schemas.microsoft.com/office/word/2010/wordprocessingInk" xmlns:wne="http://schemas.microsoft.com/office/word/2006/wordml" xmlns:wps="http://schemas.microsoft.com/office/word/2010/wordprocessingShape" mc:Ignorable="w14 wp14">
   <w:body>
     <w:p>
-      <w:pPr>
-        <w:spacing w:after="80"/>
-        <w:jc w:val="left"/>
-      </w:pPr>
       <w:r>
         <w:rPr>
           <w:rFonts w:ascii="Calibri" w:hAnsi="Calibri" w:eastAsia="Calibri"/>
@@ -15,13 +11,10 @@
           <w:color w:val="1A2332"/>
           <w:sz w:val="40"/>
         </w:rPr>
-        <w:t>Roads ↔ Onyx ↔ Master Column Crosswalk</w:t>
+        <w:t>Roads Export ↔ Onyx ↔ Master Column Crosswalk</w:t>
       </w:r>
     </w:p>
     <w:p>
-      <w:pPr>
-        <w:spacing w:after="320"/>
-      </w:pPr>
       <w:r>
         <w:rPr>
           <w:rFonts w:ascii="Calibri" w:hAnsi="Calibri" w:eastAsia="Calibri"/>
@@ -30,7 +23,7 @@
           <w:color w:val="5A6577"/>
           <w:sz w:val="22"/>
         </w:rPr>
-        <w:t>Guide to the Excel file: Roads_Onyx_Master_Column_Crosswalk.xlsx</w:t>
+        <w:t>Guide to Roads_Onyx_Master_Column_Crosswalk.xlsx (updated)</w:t>
       </w:r>
     </w:p>
     <w:p>
@@ -50,7 +43,7 @@
     </w:p>
     <w:p>
       <w:pPr>
-        <w:spacing w:after="160" w:before="0"/>
+        <w:spacing w:after="160"/>
       </w:pPr>
       <w:r>
         <w:rPr>
@@ -60,22 +53,7 @@
           <w:color w:val="1A2332"/>
           <w:sz w:val="22"/>
         </w:rPr>
-        <w:t>This Excel workbook maps how the same operational data appears across three views that all pull from one master dispatch program. It shows which column in one view corresponds to which column in the others, and notes the formula or rule for each field.</w:t>
-      </w:r>
-    </w:p>
-    <w:p>
-      <w:pPr>
-        <w:spacing w:after="80" w:before="0"/>
-      </w:pPr>
-      <w:r>
-        <w:rPr>
-          <w:rFonts w:ascii="Calibri" w:hAnsi="Calibri" w:eastAsia="Calibri"/>
-          <w:b w:val="0"/>
-          <w:i w:val="0"/>
-          <w:color w:val="1A2332"/>
-          <w:sz w:val="22"/>
-        </w:rPr>
-        <w:t>The three views are:</w:t>
+        <w:t>This Excel maps corresponding columns across three views of the same dispatch data.</w:t>
       </w:r>
     </w:p>
     <w:p>
@@ -89,7 +67,7 @@
           <w:i w:val="0"/>
           <w:sz w:val="22"/>
         </w:rPr>
-        <w:t xml:space="preserve">Roads — </w:t>
+        <w:t xml:space="preserve">Roads export file — </w:t>
       </w:r>
       <w:r>
         <w:rPr>
@@ -98,7 +76,7 @@
           <w:i w:val="0"/>
           <w:sz w:val="22"/>
         </w:rPr>
-        <w:t>GSF Utilization Report (office-level rollup: utilization %, crews, sets, jobs, people saved).</w:t>
+        <w:t>Wide job/resource export. Includes the Requested column and other job, contact, equipment, and rate fields.</w:t>
       </w:r>
     </w:p>
     <w:p>
@@ -121,7 +99,7 @@
           <w:i w:val="0"/>
           <w:sz w:val="22"/>
         </w:rPr>
-        <w:t>Daily dispatch extract (one row per ticket: client, staff requested/sent, saved, AFAD sent, etc.).</w:t>
+        <w:t>Daily dispatch extract (Client, Ticket #, Total Staff Requested/Sent, Total Saved, AFAD Sent, etc.).</w:t>
       </w:r>
     </w:p>
     <w:p>
@@ -144,7 +122,7 @@
           <w:i w:val="0"/>
           <w:sz w:val="22"/>
         </w:rPr>
-        <w:t>Dispatch dashboard (job-level source: customer, job number, required, assignments, unfilled, GSF flag, etc.).</w:t>
+        <w:t>Dispatch dashboard (Customer, Job Number, Required, Assignments, Unfilled, GSF, WO Number, etc.).</w:t>
       </w:r>
     </w:p>
     <w:p>
@@ -159,12 +137,12 @@
           <w:color w:val="0D6E6E"/>
           <w:sz w:val="32"/>
         </w:rPr>
-        <w:t>2. How to read the Excel file</w:t>
+        <w:t>2. What changed in this update</w:t>
       </w:r>
     </w:p>
     <w:p>
       <w:pPr>
-        <w:spacing w:after="160" w:before="0"/>
+        <w:spacing w:after="160"/>
       </w:pPr>
       <w:r>
         <w:rPr>
@@ -174,7 +152,22 @@
           <w:color w:val="1A2332"/>
           <w:sz w:val="22"/>
         </w:rPr>
-        <w:t>On the “Column Crosswalk” sheet, each vertical column is one matched field group. Within each group the three views are stacked top to bottom:</w:t>
+        <w:t>Earlier versions incorrectly treated the GSF Utilization rollup as “Roads.” That was wrong.</w:t>
+      </w:r>
+    </w:p>
+    <w:p>
+      <w:pPr>
+        <w:spacing w:after="160"/>
+      </w:pPr>
+      <w:r>
+        <w:rPr>
+          <w:rFonts w:ascii="Calibri" w:hAnsi="Calibri" w:eastAsia="Calibri"/>
+          <w:b w:val="0"/>
+          <w:i w:val="0"/>
+          <w:color w:val="1A2332"/>
+          <w:sz w:val="22"/>
+        </w:rPr>
+        <w:t>Roads is the Roads export file you identified. That export includes Requested, which is now mapped explicitly:</w:t>
       </w:r>
     </w:p>
     <w:p>
@@ -188,7 +181,7 @@
           <w:i w:val="0"/>
           <w:sz w:val="22"/>
         </w:rPr>
-        <w:t>Roads column</w:t>
+        <w:t>Roads Requested</w:t>
       </w:r>
       <w:r>
         <w:rPr>
@@ -197,13 +190,8 @@
           <w:i w:val="0"/>
           <w:sz w:val="22"/>
         </w:rPr>
-        <w:t xml:space="preserve"> — column heading in bold; formula/rule in italic underneath</w:t>
+        <w:t xml:space="preserve"> → </w:t>
       </w:r>
-    </w:p>
-    <w:p>
-      <w:pPr>
-        <w:pStyle w:val="ListBullet"/>
-      </w:pPr>
       <w:r>
         <w:rPr>
           <w:rFonts w:ascii="Calibri" w:hAnsi="Calibri" w:eastAsia="Calibri"/>
@@ -211,7 +199,7 @@
           <w:i w:val="0"/>
           <w:sz w:val="22"/>
         </w:rPr>
-        <w:t>cooresponding Onyx Column</w:t>
+        <w:t>Onyx Total Staff Requested</w:t>
       </w:r>
       <w:r>
         <w:rPr>
@@ -220,13 +208,8 @@
           <w:i w:val="0"/>
           <w:sz w:val="22"/>
         </w:rPr>
-        <w:t xml:space="preserve"> — column heading in bold; formula/rule in italic underneath</w:t>
+        <w:t xml:space="preserve"> → </w:t>
       </w:r>
-    </w:p>
-    <w:p>
-      <w:pPr>
-        <w:pStyle w:val="ListBullet"/>
-      </w:pPr>
       <w:r>
         <w:rPr>
           <w:rFonts w:ascii="Calibri" w:hAnsi="Calibri" w:eastAsia="Calibri"/>
@@ -234,21 +217,12 @@
           <w:i w:val="0"/>
           <w:sz w:val="22"/>
         </w:rPr>
-        <w:t>Cooresponding Master Column</w:t>
-      </w:r>
-      <w:r>
-        <w:rPr>
-          <w:rFonts w:ascii="Calibri" w:hAnsi="Calibri" w:eastAsia="Calibri"/>
-          <w:b w:val="0"/>
-          <w:i w:val="0"/>
-          <w:sz w:val="22"/>
-        </w:rPr>
-        <w:t xml:space="preserve"> — column heading in bold; formula/rule in italic underneath</w:t>
+        <w:t>Master Required</w:t>
       </w:r>
     </w:p>
     <w:p>
       <w:pPr>
-        <w:spacing w:after="160" w:before="0"/>
+        <w:spacing w:after="160"/>
       </w:pPr>
       <w:r>
         <w:rPr>
@@ -258,22 +232,7 @@
           <w:color w:val="1A2332"/>
           <w:sz w:val="22"/>
         </w:rPr>
-        <w:t>If a view has no matching field for that concept, that cell is left blank. That does not mean the data is missing from the business process — only that that particular report does not show it as its own column.</w:t>
-      </w:r>
-    </w:p>
-    <w:p>
-      <w:pPr>
-        <w:spacing w:after="160" w:before="0"/>
-      </w:pPr>
-      <w:r>
-        <w:rPr>
-          <w:rFonts w:ascii="Calibri" w:hAnsi="Calibri" w:eastAsia="Calibri"/>
-          <w:b w:val="0"/>
-          <w:i w:val="0"/>
-          <w:color w:val="1A2332"/>
-          <w:sz w:val="22"/>
-        </w:rPr>
-        <w:t>There is also a “Legend &amp; Notes” sheet and a “Stacked List (vertical)” sheet with the same mappings in a taller, print-friendly layout.</w:t>
+        <w:t>That Requested stack is the first data column in the Excel and is highlighted in green.</w:t>
       </w:r>
     </w:p>
     <w:p>
@@ -288,388 +247,7 @@
           <w:color w:val="0D6E6E"/>
           <w:sz w:val="32"/>
         </w:rPr>
-        <w:t>3. Key column correspondences</w:t>
-      </w:r>
-    </w:p>
-    <w:p>
-      <w:pPr>
-        <w:pStyle w:val="Heading2"/>
-      </w:pPr>
-      <w:r>
-        <w:rPr>
-          <w:rFonts w:ascii="Calibri" w:hAnsi="Calibri" w:eastAsia="Calibri"/>
-          <w:b/>
-          <w:i w:val="0"/>
-          <w:color w:val="0D6E6E"/>
-          <w:sz w:val="26"/>
-        </w:rPr>
-        <w:t>Identity and location</w:t>
-      </w:r>
-    </w:p>
-    <w:p>
-      <w:pPr>
-        <w:spacing w:after="80" w:before="0"/>
-      </w:pPr>
-      <w:r>
-        <w:rPr>
-          <w:rFonts w:ascii="Calibri" w:hAnsi="Calibri" w:eastAsia="Calibri"/>
-          <w:b w:val="0"/>
-          <w:i w:val="0"/>
-          <w:color w:val="1A2332"/>
-          <w:sz w:val="22"/>
-        </w:rPr>
-        <w:t>These fields identify the same job or place across systems:</w:t>
-      </w:r>
-    </w:p>
-    <w:tbl>
-      <w:tblPr>
-        <w:tblStyle w:val="TableGrid"/>
-        <w:tblW w:type="auto" w:w="0"/>
-        <w:tblLook w:firstColumn="1" w:firstRow="1" w:lastColumn="0" w:lastRow="0" w:noHBand="0" w:noVBand="1" w:val="04A0"/>
-      </w:tblPr>
-      <w:tblGrid>
-        <w:gridCol w:w="3120"/>
-        <w:gridCol w:w="3120"/>
-        <w:gridCol w:w="3120"/>
-      </w:tblGrid>
-      <w:tr>
-        <w:tc>
-          <w:tcPr>
-            <w:tcW w:type="dxa" w:w="3120"/>
-          </w:tcPr>
-          <w:p>
-            <w:r>
-              <w:rPr>
-                <w:rFonts w:ascii="Calibri" w:hAnsi="Calibri" w:eastAsia="Calibri"/>
-                <w:b/>
-                <w:i w:val="0"/>
-                <w:sz w:val="20"/>
-              </w:rPr>
-              <w:t>Roads</w:t>
-            </w:r>
-          </w:p>
-        </w:tc>
-        <w:tc>
-          <w:tcPr>
-            <w:tcW w:type="dxa" w:w="3120"/>
-          </w:tcPr>
-          <w:p>
-            <w:r>
-              <w:rPr>
-                <w:rFonts w:ascii="Calibri" w:hAnsi="Calibri" w:eastAsia="Calibri"/>
-                <w:b/>
-                <w:i w:val="0"/>
-                <w:sz w:val="20"/>
-              </w:rPr>
-              <w:t>Onyx</w:t>
-            </w:r>
-          </w:p>
-        </w:tc>
-        <w:tc>
-          <w:tcPr>
-            <w:tcW w:type="dxa" w:w="3120"/>
-          </w:tcPr>
-          <w:p>
-            <w:r>
-              <w:rPr>
-                <w:rFonts w:ascii="Calibri" w:hAnsi="Calibri" w:eastAsia="Calibri"/>
-                <w:b/>
-                <w:i w:val="0"/>
-                <w:sz w:val="20"/>
-              </w:rPr>
-              <w:t>Master</w:t>
-            </w:r>
-          </w:p>
-        </w:tc>
-      </w:tr>
-      <w:tr>
-        <w:tc>
-          <w:tcPr>
-            <w:tcW w:type="dxa" w:w="3120"/>
-          </w:tcPr>
-          <w:p>
-            <w:r>
-              <w:rPr>
-                <w:rFonts w:ascii="Calibri" w:hAnsi="Calibri" w:eastAsia="Calibri"/>
-                <w:b w:val="0"/>
-                <w:i w:val="0"/>
-                <w:sz w:val="20"/>
-              </w:rPr>
-              <w:t>Offices</w:t>
-            </w:r>
-          </w:p>
-        </w:tc>
-        <w:tc>
-          <w:tcPr>
-            <w:tcW w:type="dxa" w:w="3120"/>
-          </w:tcPr>
-          <w:p>
-            <w:r>
-              <w:rPr>
-                <w:rFonts w:ascii="Calibri" w:hAnsi="Calibri" w:eastAsia="Calibri"/>
-                <w:b w:val="0"/>
-                <w:i w:val="0"/>
-                <w:sz w:val="20"/>
-              </w:rPr>
-              <w:t>Branch</w:t>
-            </w:r>
-          </w:p>
-        </w:tc>
-        <w:tc>
-          <w:tcPr>
-            <w:tcW w:type="dxa" w:w="3120"/>
-          </w:tcPr>
-          <w:p>
-            <w:r>
-              <w:rPr>
-                <w:rFonts w:ascii="Calibri" w:hAnsi="Calibri" w:eastAsia="Calibri"/>
-                <w:b w:val="0"/>
-                <w:i w:val="0"/>
-                <w:sz w:val="20"/>
-              </w:rPr>
-              <w:t>Dispatching</w:t>
-            </w:r>
-          </w:p>
-        </w:tc>
-      </w:tr>
-      <w:tr>
-        <w:tc>
-          <w:tcPr>
-            <w:tcW w:type="dxa" w:w="3120"/>
-          </w:tcPr>
-          <w:p>
-            <w:r>
-              <w:rPr>
-                <w:rFonts w:ascii="Calibri" w:hAnsi="Calibri" w:eastAsia="Calibri"/>
-                <w:b w:val="0"/>
-                <w:i w:val="0"/>
-                <w:sz w:val="20"/>
-              </w:rPr>
-              <w:t>(no ticket-level ID)</w:t>
-            </w:r>
-          </w:p>
-        </w:tc>
-        <w:tc>
-          <w:tcPr>
-            <w:tcW w:type="dxa" w:w="3120"/>
-          </w:tcPr>
-          <w:p>
-            <w:r>
-              <w:rPr>
-                <w:rFonts w:ascii="Calibri" w:hAnsi="Calibri" w:eastAsia="Calibri"/>
-                <w:b w:val="0"/>
-                <w:i w:val="0"/>
-                <w:sz w:val="20"/>
-              </w:rPr>
-              <w:t>Ticket #</w:t>
-            </w:r>
-          </w:p>
-        </w:tc>
-        <w:tc>
-          <w:tcPr>
-            <w:tcW w:type="dxa" w:w="3120"/>
-          </w:tcPr>
-          <w:p>
-            <w:r>
-              <w:rPr>
-                <w:rFonts w:ascii="Calibri" w:hAnsi="Calibri" w:eastAsia="Calibri"/>
-                <w:b w:val="0"/>
-                <w:i w:val="0"/>
-                <w:sz w:val="20"/>
-              </w:rPr>
-              <w:t>Job Number</w:t>
-            </w:r>
-          </w:p>
-        </w:tc>
-      </w:tr>
-      <w:tr>
-        <w:tc>
-          <w:tcPr>
-            <w:tcW w:type="dxa" w:w="3120"/>
-          </w:tcPr>
-          <w:p>
-            <w:r>
-              <w:rPr>
-                <w:rFonts w:ascii="Calibri" w:hAnsi="Calibri" w:eastAsia="Calibri"/>
-                <w:b w:val="0"/>
-                <w:i w:val="0"/>
-                <w:sz w:val="20"/>
-              </w:rPr>
-              <w:t>(blank)</w:t>
-            </w:r>
-          </w:p>
-        </w:tc>
-        <w:tc>
-          <w:tcPr>
-            <w:tcW w:type="dxa" w:w="3120"/>
-          </w:tcPr>
-          <w:p>
-            <w:r>
-              <w:rPr>
-                <w:rFonts w:ascii="Calibri" w:hAnsi="Calibri" w:eastAsia="Calibri"/>
-                <w:b w:val="0"/>
-                <w:i w:val="0"/>
-                <w:sz w:val="20"/>
-              </w:rPr>
-              <w:t>Client</w:t>
-            </w:r>
-          </w:p>
-        </w:tc>
-        <w:tc>
-          <w:tcPr>
-            <w:tcW w:type="dxa" w:w="3120"/>
-          </w:tcPr>
-          <w:p>
-            <w:r>
-              <w:rPr>
-                <w:rFonts w:ascii="Calibri" w:hAnsi="Calibri" w:eastAsia="Calibri"/>
-                <w:b w:val="0"/>
-                <w:i w:val="0"/>
-                <w:sz w:val="20"/>
-              </w:rPr>
-              <w:t>Customer</w:t>
-            </w:r>
-          </w:p>
-        </w:tc>
-      </w:tr>
-      <w:tr>
-        <w:tc>
-          <w:tcPr>
-            <w:tcW w:type="dxa" w:w="3120"/>
-          </w:tcPr>
-          <w:p>
-            <w:r>
-              <w:rPr>
-                <w:rFonts w:ascii="Calibri" w:hAnsi="Calibri" w:eastAsia="Calibri"/>
-                <w:b w:val="0"/>
-                <w:i w:val="0"/>
-                <w:sz w:val="20"/>
-              </w:rPr>
-              <w:t>(blank)</w:t>
-            </w:r>
-          </w:p>
-        </w:tc>
-        <w:tc>
-          <w:tcPr>
-            <w:tcW w:type="dxa" w:w="3120"/>
-          </w:tcPr>
-          <w:p>
-            <w:r>
-              <w:rPr>
-                <w:rFonts w:ascii="Calibri" w:hAnsi="Calibri" w:eastAsia="Calibri"/>
-                <w:b w:val="0"/>
-                <w:i w:val="0"/>
-                <w:sz w:val="20"/>
-              </w:rPr>
-              <w:t>Job Type</w:t>
-            </w:r>
-          </w:p>
-        </w:tc>
-        <w:tc>
-          <w:tcPr>
-            <w:tcW w:type="dxa" w:w="3120"/>
-          </w:tcPr>
-          <w:p>
-            <w:r>
-              <w:rPr>
-                <w:rFonts w:ascii="Calibri" w:hAnsi="Calibri" w:eastAsia="Calibri"/>
-                <w:b w:val="0"/>
-                <w:i w:val="0"/>
-                <w:sz w:val="20"/>
-              </w:rPr>
-              <w:t>Job Type</w:t>
-            </w:r>
-          </w:p>
-        </w:tc>
-      </w:tr>
-    </w:tbl>
-    <w:p>
-      <w:pPr>
-        <w:spacing w:after="160" w:before="0"/>
-      </w:pPr>
-      <w:r>
-        <w:rPr>
-          <w:rFonts w:ascii="Calibri" w:hAnsi="Calibri" w:eastAsia="Calibri"/>
-          <w:b w:val="0"/>
-          <w:i w:val="0"/>
-          <w:color w:val="1A2332"/>
-          <w:sz w:val="22"/>
-        </w:rPr>
-      </w:r>
-    </w:p>
-    <w:p>
-      <w:pPr>
-        <w:spacing w:after="160"/>
-      </w:pPr>
-      <w:r>
-        <w:rPr>
-          <w:rFonts w:ascii="Calibri" w:hAnsi="Calibri" w:eastAsia="Calibri"/>
-          <w:b/>
-          <w:i w:val="0"/>
-          <w:color w:val="1A2332"/>
-          <w:sz w:val="22"/>
-        </w:rPr>
-        <w:t xml:space="preserve">Important: </w:t>
-      </w:r>
-      <w:r>
-        <w:rPr>
-          <w:rFonts w:ascii="Calibri" w:hAnsi="Calibri" w:eastAsia="Calibri"/>
-          <w:b w:val="0"/>
-          <w:i w:val="0"/>
-          <w:color w:val="1A2332"/>
-          <w:sz w:val="22"/>
-        </w:rPr>
-        <w:t xml:space="preserve">Job Number (Master) and Ticket # (Onyx) are the same identifier. </w:t>
-      </w:r>
-      <w:r>
-        <w:rPr>
-          <w:rFonts w:ascii="Calibri" w:hAnsi="Calibri" w:eastAsia="Calibri"/>
-          <w:b/>
-          <w:i w:val="0"/>
-          <w:color w:val="1A2332"/>
-          <w:sz w:val="22"/>
-        </w:rPr>
-        <w:t>WO Number (Master) is different</w:t>
-      </w:r>
-      <w:r>
-        <w:rPr>
-          <w:rFonts w:ascii="Calibri" w:hAnsi="Calibri" w:eastAsia="Calibri"/>
-          <w:b w:val="0"/>
-          <w:i w:val="0"/>
-          <w:color w:val="1A2332"/>
-          <w:sz w:val="22"/>
-        </w:rPr>
-        <w:t xml:space="preserve"> — it is the customer work-order / EWO reference, not the internal job ID.</w:t>
-      </w:r>
-    </w:p>
-    <w:p>
-      <w:pPr>
-        <w:pStyle w:val="Heading2"/>
-      </w:pPr>
-      <w:r>
-        <w:rPr>
-          <w:rFonts w:ascii="Calibri" w:hAnsi="Calibri" w:eastAsia="Calibri"/>
-          <w:b/>
-          <w:i w:val="0"/>
-          <w:color w:val="0D6E6E"/>
-          <w:sz w:val="26"/>
-        </w:rPr>
-        <w:t>Staffing</w:t>
-      </w:r>
-    </w:p>
-    <w:p>
-      <w:pPr>
-        <w:spacing w:after="160" w:before="0"/>
-      </w:pPr>
-      <w:r>
-        <w:rPr>
-          <w:rFonts w:ascii="Calibri" w:hAnsi="Calibri" w:eastAsia="Calibri"/>
-          <w:b w:val="0"/>
-          <w:i w:val="0"/>
-          <w:color w:val="1A2332"/>
-          <w:sz w:val="22"/>
-        </w:rPr>
-        <w:t>Master Required lines up with Onyx Total Staff Requested. Master Assignments lines up with Onyx Total Staff Sent conceptually, but they do not always match numerically (Onyx sometimes includes shadows or extras). Roads Total Crews and Flagging Crews are rollups of sent/assigned staff for an office and period.</w:t>
+        <w:t>3. How to read the Excel</w:t>
       </w:r>
     </w:p>
     <w:p>
@@ -684,87 +262,54 @@
           <w:color w:val="1A2332"/>
           <w:sz w:val="22"/>
         </w:rPr>
-        <w:t xml:space="preserve">Do not equate </w:t>
+        <w:t>Each vertical column is one matched field. Stacked top to bottom:</w:t>
       </w:r>
-      <w:r>
-        <w:rPr>
-          <w:rFonts w:ascii="Calibri" w:hAnsi="Calibri" w:eastAsia="Calibri"/>
-          <w:b/>
-          <w:i w:val="0"/>
-          <w:color w:val="1A2332"/>
-          <w:sz w:val="22"/>
-        </w:rPr>
-        <w:t>Master Unfilled</w:t>
-      </w:r>
+    </w:p>
+    <w:p>
+      <w:pPr>
+        <w:pStyle w:val="ListBullet"/>
+      </w:pPr>
       <w:r>
         <w:rPr>
           <w:rFonts w:ascii="Calibri" w:hAnsi="Calibri" w:eastAsia="Calibri"/>
           <w:b w:val="0"/>
           <w:i w:val="0"/>
-          <w:color w:val="1A2332"/>
           <w:sz w:val="22"/>
         </w:rPr>
-        <w:t xml:space="preserve"> with </w:t>
+        <w:t>Roads column (bold) + Roads formula (italic)</w:t>
       </w:r>
-      <w:r>
-        <w:rPr>
-          <w:rFonts w:ascii="Calibri" w:hAnsi="Calibri" w:eastAsia="Calibri"/>
-          <w:b/>
-          <w:i w:val="0"/>
-          <w:color w:val="1A2332"/>
-          <w:sz w:val="22"/>
-        </w:rPr>
-        <w:t>Onyx Total Saved</w:t>
-      </w:r>
+    </w:p>
+    <w:p>
+      <w:pPr>
+        <w:pStyle w:val="ListBullet"/>
+      </w:pPr>
       <w:r>
         <w:rPr>
           <w:rFonts w:ascii="Calibri" w:hAnsi="Calibri" w:eastAsia="Calibri"/>
           <w:b w:val="0"/>
           <w:i w:val="0"/>
-          <w:color w:val="1A2332"/>
           <w:sz w:val="22"/>
         </w:rPr>
-        <w:t xml:space="preserve">. Unfilled is about open assignment slots; Total Saved is </w:t>
+        <w:t>cooresponding Onyx Column (bold) + Onyx formula (italic)</w:t>
       </w:r>
-      <w:r>
-        <w:rPr>
-          <w:rFonts w:ascii="Calibri" w:hAnsi="Calibri" w:eastAsia="Calibri"/>
-          <w:b w:val="0"/>
-          <w:i/>
-          <w:color w:val="1A2332"/>
-          <w:sz w:val="22"/>
-        </w:rPr>
-        <w:t>max(0, Requested − Sent)</w:t>
-      </w:r>
+    </w:p>
+    <w:p>
+      <w:pPr>
+        <w:pStyle w:val="ListBullet"/>
+      </w:pPr>
       <w:r>
         <w:rPr>
           <w:rFonts w:ascii="Calibri" w:hAnsi="Calibri" w:eastAsia="Calibri"/>
           <w:b w:val="0"/>
           <w:i w:val="0"/>
-          <w:color w:val="1A2332"/>
           <w:sz w:val="22"/>
         </w:rPr>
-        <w:t>.</w:t>
+        <w:t>Cooresponding Master Column (bold) + Master formula (italic)</w:t>
       </w:r>
     </w:p>
     <w:p>
       <w:pPr>
-        <w:pStyle w:val="Heading2"/>
-      </w:pPr>
-      <w:r>
-        <w:rPr>
-          <w:rFonts w:ascii="Calibri" w:hAnsi="Calibri" w:eastAsia="Calibri"/>
-          <w:b/>
-          <w:i w:val="0"/>
-          <w:color w:val="0D6E6E"/>
-          <w:sz w:val="26"/>
-        </w:rPr>
-        <w:t>GSF / AFAD</w:t>
-      </w:r>
-    </w:p>
-    <w:p>
-      <w:pPr>
-        <w:spacing w:after="160" w:before="0"/>
+        <w:spacing w:after="160"/>
       </w:pPr>
       <w:r>
         <w:rPr>
@@ -774,32 +319,7 @@
           <w:color w:val="1A2332"/>
           <w:sz w:val="22"/>
         </w:rPr>
-        <w:t>Master GSF Yes/No corresponds to Onyx Ticket Type = GSF. Roads GSF Jobs is a count of those GSF tickets; Total Jobs is a count of all tickets. Onyx AFAD Sent feeds Roads GSF In Field Sets (summed). The Master dashboard view reviewed here does not show an AFAD count column.</w:t>
-      </w:r>
-    </w:p>
-    <w:p>
-      <w:pPr>
-        <w:spacing w:after="160"/>
-      </w:pPr>
-      <w:r>
-        <w:rPr>
-          <w:rFonts w:ascii="Calibri" w:hAnsi="Calibri" w:eastAsia="Calibri"/>
-          <w:b/>
-          <w:i w:val="0"/>
-          <w:color w:val="1A2332"/>
-          <w:sz w:val="22"/>
-        </w:rPr>
-        <w:t>Roads People Saved equals GSF In Field Sets</w:t>
-      </w:r>
-      <w:r>
-        <w:rPr>
-          <w:rFonts w:ascii="Calibri" w:hAnsi="Calibri" w:eastAsia="Calibri"/>
-          <w:b w:val="0"/>
-          <w:i w:val="0"/>
-          <w:color w:val="1A2332"/>
-          <w:sz w:val="22"/>
-        </w:rPr>
-        <w:t xml:space="preserve"> — it is not the sum of Onyx Total Saved.</w:t>
+        <w:t>Blank cell = no corresponding column in that view.</w:t>
       </w:r>
     </w:p>
     <w:p>
@@ -814,22 +334,7 @@
           <w:color w:val="0D6E6E"/>
           <w:sz w:val="32"/>
         </w:rPr>
-        <w:t>4. Roads-only calculated columns</w:t>
-      </w:r>
-    </w:p>
-    <w:p>
-      <w:pPr>
-        <w:spacing w:after="80" w:before="0"/>
-      </w:pPr>
-      <w:r>
-        <w:rPr>
-          <w:rFonts w:ascii="Calibri" w:hAnsi="Calibri" w:eastAsia="Calibri"/>
-          <w:b w:val="0"/>
-          <w:i w:val="0"/>
-          <w:color w:val="1A2332"/>
-          <w:sz w:val="22"/>
-        </w:rPr>
-        <w:t>These percentages exist on the Roads (utilization) report only. They are computed from the rolled-up inputs:</w:t>
+        <w:t>4. Other important staffing / ID mappings</w:t>
       </w:r>
     </w:p>
     <w:p>
@@ -839,20 +344,11 @@
       <w:r>
         <w:rPr>
           <w:rFonts w:ascii="Calibri" w:hAnsi="Calibri" w:eastAsia="Calibri"/>
-          <w:b/>
+          <w:b w:val="0"/>
           <w:i w:val="0"/>
           <w:sz w:val="22"/>
         </w:rPr>
-        <w:t xml:space="preserve">GSF Utilization %: </w:t>
-      </w:r>
-      <w:r>
-        <w:rPr>
-          <w:rFonts w:ascii="Calibri" w:hAnsi="Calibri" w:eastAsia="Calibri"/>
-          <w:b w:val="0"/>
-          <w:i/>
-          <w:sz w:val="22"/>
-        </w:rPr>
-        <w:t>GSF In Field Sets ÷ GSF Sets on Hand</w:t>
+        <w:t>Roads Required Resources / On the Clock relate to Onyx Staff Requested/Sent and Master Required/Assignments.</w:t>
       </w:r>
     </w:p>
     <w:p>
@@ -862,20 +358,11 @@
       <w:r>
         <w:rPr>
           <w:rFonts w:ascii="Calibri" w:hAnsi="Calibri" w:eastAsia="Calibri"/>
-          <w:b/>
+          <w:b w:val="0"/>
           <w:i w:val="0"/>
           <w:sz w:val="22"/>
         </w:rPr>
-        <w:t xml:space="preserve">GSF infield set / total jobs %: </w:t>
-      </w:r>
-      <w:r>
-        <w:rPr>
-          <w:rFonts w:ascii="Calibri" w:hAnsi="Calibri" w:eastAsia="Calibri"/>
-          <w:b w:val="0"/>
-          <w:i/>
-          <w:sz w:val="22"/>
-        </w:rPr>
-        <w:t>GSF Jobs ÷ Total Jobs</w:t>
+        <w:t>Master Job Number = Onyx Ticket # (same internal ID).</w:t>
       </w:r>
     </w:p>
     <w:p>
@@ -885,20 +372,11 @@
       <w:r>
         <w:rPr>
           <w:rFonts w:ascii="Calibri" w:hAnsi="Calibri" w:eastAsia="Calibri"/>
-          <w:b/>
+          <w:b w:val="0"/>
           <w:i w:val="0"/>
           <w:sz w:val="22"/>
         </w:rPr>
-        <w:t xml:space="preserve">GSF Integration (Crews) %: </w:t>
-      </w:r>
-      <w:r>
-        <w:rPr>
-          <w:rFonts w:ascii="Calibri" w:hAnsi="Calibri" w:eastAsia="Calibri"/>
-          <w:b w:val="0"/>
-          <w:i/>
-          <w:sz w:val="22"/>
-        </w:rPr>
-        <w:t>GSF Sets on Hand ÷ Flagging Crews</w:t>
+        <w:t>Master WO Number is different (customer work-order / EWO).</w:t>
       </w:r>
     </w:p>
     <w:p>
@@ -908,58 +386,11 @@
       <w:r>
         <w:rPr>
           <w:rFonts w:ascii="Calibri" w:hAnsi="Calibri" w:eastAsia="Calibri"/>
-          <w:b/>
+          <w:b w:val="0"/>
           <w:i w:val="0"/>
           <w:sz w:val="22"/>
         </w:rPr>
-        <w:t xml:space="preserve">GSF Fulfillment Crews %: </w:t>
-      </w:r>
-      <w:r>
-        <w:rPr>
-          <w:rFonts w:ascii="Calibri" w:hAnsi="Calibri" w:eastAsia="Calibri"/>
-          <w:b w:val="0"/>
-          <w:i/>
-          <w:sz w:val="22"/>
-        </w:rPr>
-        <w:t>GSF In Field Sets ÷ Flagging Crews</w:t>
-      </w:r>
-    </w:p>
-    <w:p>
-      <w:pPr>
-        <w:pStyle w:val="ListBullet"/>
-      </w:pPr>
-      <w:r>
-        <w:rPr>
-          <w:rFonts w:ascii="Calibri" w:hAnsi="Calibri" w:eastAsia="Calibri"/>
-          <w:b/>
-          <w:i w:val="0"/>
-          <w:sz w:val="22"/>
-        </w:rPr>
-        <w:t xml:space="preserve">People Saved: </w:t>
-      </w:r>
-      <w:r>
-        <w:rPr>
-          <w:rFonts w:ascii="Calibri" w:hAnsi="Calibri" w:eastAsia="Calibri"/>
-          <w:b w:val="0"/>
-          <w:i/>
-          <w:sz w:val="22"/>
-        </w:rPr>
-        <w:t>Same value as GSF In Field Sets</w:t>
-      </w:r>
-    </w:p>
-    <w:p>
-      <w:pPr>
-        <w:spacing w:after="160" w:before="0"/>
-      </w:pPr>
-      <w:r>
-        <w:rPr>
-          <w:rFonts w:ascii="Calibri" w:hAnsi="Calibri" w:eastAsia="Calibri"/>
-          <w:b w:val="0"/>
-          <w:i w:val="0"/>
-          <w:color w:val="1A2332"/>
-          <w:sz w:val="22"/>
-        </w:rPr>
-        <w:t>Company Total rows on Roads sum the numeric inputs, then recompute these percentages from the totals (they are not averages of office percentages).</w:t>
+        <w:t>Onyx Total Saved = max(0, Requested − Sent). That is not the same as Master Unfilled.</w:t>
       </w:r>
     </w:p>
     <w:p>
@@ -974,22 +405,7 @@
           <w:color w:val="0D6E6E"/>
           <w:sz w:val="32"/>
         </w:rPr>
-        <w:t>5. Consistency findings (Beaver Falls, Oct 5, 2026)</w:t>
-      </w:r>
-    </w:p>
-    <w:p>
-      <w:pPr>
-        <w:spacing w:after="160" w:before="0"/>
-      </w:pPr>
-      <w:r>
-        <w:rPr>
-          <w:rFonts w:ascii="Calibri" w:hAnsi="Calibri" w:eastAsia="Calibri"/>
-          <w:b w:val="0"/>
-          <w:i w:val="0"/>
-          <w:color w:val="1A2332"/>
-          <w:sz w:val="22"/>
-        </w:rPr>
-        <w:t>When Master and Onyx were compared ticket-by-ticket for Beaver Falls on that day:</w:t>
+        <w:t>5. Workbook sheets</w:t>
       </w:r>
     </w:p>
     <w:p>
@@ -1003,7 +419,7 @@
           <w:i w:val="0"/>
           <w:sz w:val="22"/>
         </w:rPr>
-        <w:t>28 of 28 Master jobs appeared on Onyx by Job Number = Ticket # (plus one Onyx-only ticket: 004862-129).</w:t>
+        <w:t>Column Crosswalk — main stacked map (Requested highlighted).</w:t>
       </w:r>
     </w:p>
     <w:p>
@@ -1017,7 +433,7 @@
           <w:i w:val="0"/>
           <w:sz w:val="22"/>
         </w:rPr>
-        <w:t>Customer/Client, Job Type, Branch/Dispatching, and GSF flag lined up.</w:t>
+        <w:t>Legend &amp; Notes — reading instructions and caveats.</w:t>
       </w:r>
     </w:p>
     <w:p>
@@ -1031,35 +447,7 @@
           <w:i w:val="0"/>
           <w:sz w:val="22"/>
         </w:rPr>
-        <w:t>22 tickets matched Required/Requested and Assignments/Sent exactly; 6 differed (often shadows/extras on Onyx, and both GSF jobs had different headcounts).</w:t>
-      </w:r>
-    </w:p>
-    <w:p>
-      <w:pPr>
-        <w:pStyle w:val="ListBullet"/>
-      </w:pPr>
-      <w:r>
-        <w:rPr>
-          <w:rFonts w:ascii="Calibri" w:hAnsi="Calibri" w:eastAsia="Calibri"/>
-          <w:b w:val="0"/>
-          <w:i w:val="0"/>
-          <w:sz w:val="22"/>
-        </w:rPr>
-        <w:t>Master Unfilled was 0 on every row; Onyx Total Saved totaled 1 — confirming different definitions.</w:t>
-      </w:r>
-    </w:p>
-    <w:p>
-      <w:pPr>
-        <w:pStyle w:val="ListBullet"/>
-      </w:pPr>
-      <w:r>
-        <w:rPr>
-          <w:rFonts w:ascii="Calibri" w:hAnsi="Calibri" w:eastAsia="Calibri"/>
-          <w:b w:val="0"/>
-          <w:i w:val="0"/>
-          <w:sz w:val="22"/>
-        </w:rPr>
-        <w:t>Onyx AFAD Sent totaled 4; that column is not on the Master view that was reviewed.</w:t>
+        <w:t>Stacked List (vertical) — same map for scrolling/printing.</w:t>
       </w:r>
     </w:p>
     <w:p>
@@ -1074,96 +462,12 @@
           <w:color w:val="0D6E6E"/>
           <w:sz w:val="32"/>
         </w:rPr>
-        <w:t>6. What’s in the workbook</w:t>
+        <w:t>6. Note on Roads header text</w:t>
       </w:r>
     </w:p>
     <w:p>
       <w:pPr>
-        <w:pStyle w:val="ListBullet"/>
-      </w:pPr>
-      <w:r>
-        <w:rPr>
-          <w:rFonts w:ascii="Calibri" w:hAnsi="Calibri" w:eastAsia="Calibri"/>
-          <w:b/>
-          <w:i w:val="0"/>
-          <w:sz w:val="22"/>
-        </w:rPr>
-        <w:t xml:space="preserve">Column Crosswalk — </w:t>
-      </w:r>
-      <w:r>
-        <w:rPr>
-          <w:rFonts w:ascii="Calibri" w:hAnsi="Calibri" w:eastAsia="Calibri"/>
-          <w:b w:val="0"/>
-          <w:i w:val="0"/>
-          <w:sz w:val="22"/>
-        </w:rPr>
-        <w:t>Main sheet: stacked Roads / Onyx / Master headings (bold) and formulas (italic).</w:t>
-      </w:r>
-    </w:p>
-    <w:p>
-      <w:pPr>
-        <w:pStyle w:val="ListBullet"/>
-      </w:pPr>
-      <w:r>
-        <w:rPr>
-          <w:rFonts w:ascii="Calibri" w:hAnsi="Calibri" w:eastAsia="Calibri"/>
-          <w:b/>
-          <w:i w:val="0"/>
-          <w:sz w:val="22"/>
-        </w:rPr>
-        <w:t xml:space="preserve">Legend &amp; Notes — </w:t>
-      </w:r>
-      <w:r>
-        <w:rPr>
-          <w:rFonts w:ascii="Calibri" w:hAnsi="Calibri" w:eastAsia="Calibri"/>
-          <w:b w:val="0"/>
-          <w:i w:val="0"/>
-          <w:sz w:val="22"/>
-        </w:rPr>
-        <w:t>How to read the file and known caveats.</w:t>
-      </w:r>
-    </w:p>
-    <w:p>
-      <w:pPr>
-        <w:pStyle w:val="ListBullet"/>
-      </w:pPr>
-      <w:r>
-        <w:rPr>
-          <w:rFonts w:ascii="Calibri" w:hAnsi="Calibri" w:eastAsia="Calibri"/>
-          <w:b/>
-          <w:i w:val="0"/>
-          <w:sz w:val="22"/>
-        </w:rPr>
-        <w:t xml:space="preserve">Stacked List (vertical) — </w:t>
-      </w:r>
-      <w:r>
-        <w:rPr>
-          <w:rFonts w:ascii="Calibri" w:hAnsi="Calibri" w:eastAsia="Calibri"/>
-          <w:b w:val="0"/>
-          <w:i w:val="0"/>
-          <w:sz w:val="22"/>
-        </w:rPr>
-        <w:t>Same mappings arranged down the page for easier printing.</w:t>
-      </w:r>
-    </w:p>
-    <w:p>
-      <w:pPr>
-        <w:pStyle w:val="Heading1"/>
-      </w:pPr>
-      <w:r>
-        <w:rPr>
-          <w:rFonts w:ascii="Calibri" w:hAnsi="Calibri" w:eastAsia="Calibri"/>
-          <w:b/>
-          <w:i w:val="0"/>
-          <w:color w:val="0D6E6E"/>
-          <w:sz w:val="32"/>
-        </w:rPr>
-        <w:t>7. Related files</w:t>
-      </w:r>
-    </w:p>
-    <w:p>
-      <w:pPr>
-        <w:spacing w:after="160" w:before="0"/>
+        <w:spacing w:after="160"/>
       </w:pPr>
       <w:r>
         <w:rPr>
@@ -1173,7 +477,7 @@
           <w:color w:val="1A2332"/>
           <w:sz w:val="22"/>
         </w:rPr>
-        <w:t>Companion Excel file: Roads_Onyx_Master_Column_Crosswalk.xlsx. This Word document explains what that spreadsheet shows; it does not replace it.</w:t>
+        <w:t>The Roads export screenshot is low-resolution, so some Roads header labels were reconstructed from that export plus your confirmation that Requested is a Roads column. If any Roads heading in your live file uses slightly different wording, send the exact header name and it can be corrected.</w:t>
       </w:r>
     </w:p>
     <w:p>
@@ -1185,7 +489,7 @@
           <w:color w:val="5A6577"/>
           <w:sz w:val="18"/>
         </w:rPr>
-        <w:t>Prepared to accompany the Roads / Onyx / Master column mapping for GSF utilization and daily dispatch reporting.</w:t>
+        <w:t>Companion file: Roads_Onyx_Master_Column_Crosswalk.xlsx</w:t>
       </w:r>
     </w:p>
     <w:sectPr>

</xml_diff>

<commit_message>
Rebuild crosswalk from labeled Roads Export, Onyx report, and Master dashboard
Map Roads Requested Resources → Onyx Total Staff Requested → Master Required.
Use only headers from the user-labeled screenshots; refresh the Word guide.

Co-authored-by: echenry6f <echenry6f@users.noreply.github.com>
</commit_message>
<xml_diff>
--- a/Roads_Onyx_Master_Crosswalk_Guide.docx
+++ b/Roads_Onyx_Master_Crosswalk_Guide.docx
@@ -11,7 +11,7 @@
           <w:color w:val="1A2332"/>
           <w:sz w:val="40"/>
         </w:rPr>
-        <w:t>Roads Export ↔ Onyx ↔ Master Column Crosswalk</w:t>
+        <w:t>Roads Export ↔ Onyx Report ↔ Master Dashboard</w:t>
       </w:r>
     </w:p>
     <w:p>
@@ -23,7 +23,7 @@
           <w:color w:val="5A6577"/>
           <w:sz w:val="22"/>
         </w:rPr>
-        <w:t>Guide to Roads_Onyx_Master_Column_Crosswalk.xlsx (updated)</w:t>
+        <w:t>Guide to the rebuilt Excel crosswalk</w:t>
       </w:r>
     </w:p>
     <w:p>
@@ -38,7 +38,7 @@
           <w:color w:val="0D6E6E"/>
           <w:sz w:val="32"/>
         </w:rPr>
-        <w:t>1. Purpose</w:t>
+        <w:t>1. What this Excel shows</w:t>
       </w:r>
     </w:p>
     <w:p>
@@ -53,76 +53,7 @@
           <w:color w:val="1A2332"/>
           <w:sz w:val="22"/>
         </w:rPr>
-        <w:t>This Excel maps corresponding columns across three views of the same dispatch data.</w:t>
-      </w:r>
-    </w:p>
-    <w:p>
-      <w:pPr>
-        <w:pStyle w:val="ListBullet"/>
-      </w:pPr>
-      <w:r>
-        <w:rPr>
-          <w:rFonts w:ascii="Calibri" w:hAnsi="Calibri" w:eastAsia="Calibri"/>
-          <w:b/>
-          <w:i w:val="0"/>
-          <w:sz w:val="22"/>
-        </w:rPr>
-        <w:t xml:space="preserve">Roads export file — </w:t>
-      </w:r>
-      <w:r>
-        <w:rPr>
-          <w:rFonts w:ascii="Calibri" w:hAnsi="Calibri" w:eastAsia="Calibri"/>
-          <w:b w:val="0"/>
-          <w:i w:val="0"/>
-          <w:sz w:val="22"/>
-        </w:rPr>
-        <w:t>Wide job/resource export. Includes the Requested column and other job, contact, equipment, and rate fields.</w:t>
-      </w:r>
-    </w:p>
-    <w:p>
-      <w:pPr>
-        <w:pStyle w:val="ListBullet"/>
-      </w:pPr>
-      <w:r>
-        <w:rPr>
-          <w:rFonts w:ascii="Calibri" w:hAnsi="Calibri" w:eastAsia="Calibri"/>
-          <w:b/>
-          <w:i w:val="0"/>
-          <w:sz w:val="22"/>
-        </w:rPr>
-        <w:t xml:space="preserve">Onyx — </w:t>
-      </w:r>
-      <w:r>
-        <w:rPr>
-          <w:rFonts w:ascii="Calibri" w:hAnsi="Calibri" w:eastAsia="Calibri"/>
-          <w:b w:val="0"/>
-          <w:i w:val="0"/>
-          <w:sz w:val="22"/>
-        </w:rPr>
-        <w:t>Daily dispatch extract (Client, Ticket #, Total Staff Requested/Sent, Total Saved, AFAD Sent, etc.).</w:t>
-      </w:r>
-    </w:p>
-    <w:p>
-      <w:pPr>
-        <w:pStyle w:val="ListBullet"/>
-      </w:pPr>
-      <w:r>
-        <w:rPr>
-          <w:rFonts w:ascii="Calibri" w:hAnsi="Calibri" w:eastAsia="Calibri"/>
-          <w:b/>
-          <w:i w:val="0"/>
-          <w:sz w:val="22"/>
-        </w:rPr>
-        <w:t xml:space="preserve">Master — </w:t>
-      </w:r>
-      <w:r>
-        <w:rPr>
-          <w:rFonts w:ascii="Calibri" w:hAnsi="Calibri" w:eastAsia="Calibri"/>
-          <w:b w:val="0"/>
-          <w:i w:val="0"/>
-          <w:sz w:val="22"/>
-        </w:rPr>
-        <w:t>Dispatch dashboard (Customer, Job Number, Required, Assignments, Unfilled, GSF, WO Number, etc.).</w:t>
+        <w:t>It maps corresponding columns across the three views you labeled, stacked the way you asked (Roads / Onyx / Master), with bold headings and italic formulas. Blank cells mean that view has no matching column.</w:t>
       </w:r>
     </w:p>
     <w:p>
@@ -137,37 +68,7 @@
           <w:color w:val="0D6E6E"/>
           <w:sz w:val="32"/>
         </w:rPr>
-        <w:t>2. What changed in this update</w:t>
-      </w:r>
-    </w:p>
-    <w:p>
-      <w:pPr>
-        <w:spacing w:after="160"/>
-      </w:pPr>
-      <w:r>
-        <w:rPr>
-          <w:rFonts w:ascii="Calibri" w:hAnsi="Calibri" w:eastAsia="Calibri"/>
-          <w:b w:val="0"/>
-          <w:i w:val="0"/>
-          <w:color w:val="1A2332"/>
-          <w:sz w:val="22"/>
-        </w:rPr>
-        <w:t>Earlier versions incorrectly treated the GSF Utilization rollup as “Roads.” That was wrong.</w:t>
-      </w:r>
-    </w:p>
-    <w:p>
-      <w:pPr>
-        <w:spacing w:after="160"/>
-      </w:pPr>
-      <w:r>
-        <w:rPr>
-          <w:rFonts w:ascii="Calibri" w:hAnsi="Calibri" w:eastAsia="Calibri"/>
-          <w:b w:val="0"/>
-          <w:i w:val="0"/>
-          <w:color w:val="1A2332"/>
-          <w:sz w:val="22"/>
-        </w:rPr>
-        <w:t>Roads is the Roads export file you identified. That export includes Requested, which is now mapped explicitly:</w:t>
+        <w:t>2. The three sources</w:t>
       </w:r>
     </w:p>
     <w:p>
@@ -181,7 +82,91 @@
           <w:i w:val="0"/>
           <w:sz w:val="22"/>
         </w:rPr>
-        <w:t>Roads Requested</w:t>
+        <w:t xml:space="preserve">Roads Export file — </w:t>
+      </w:r>
+      <w:r>
+        <w:rPr>
+          <w:rFonts w:ascii="Calibri" w:hAnsi="Calibri" w:eastAsia="Calibri"/>
+          <w:b w:val="0"/>
+          <w:i w:val="0"/>
+          <w:sz w:val="22"/>
+        </w:rPr>
+        <w:t>Wide export including Requested Resources and rate/certification fields.</w:t>
+      </w:r>
+    </w:p>
+    <w:p>
+      <w:pPr>
+        <w:pStyle w:val="ListBullet"/>
+      </w:pPr>
+      <w:r>
+        <w:rPr>
+          <w:rFonts w:ascii="Calibri" w:hAnsi="Calibri" w:eastAsia="Calibri"/>
+          <w:b/>
+          <w:i w:val="0"/>
+          <w:sz w:val="22"/>
+        </w:rPr>
+        <w:t xml:space="preserve">Onyx report — </w:t>
+      </w:r>
+      <w:r>
+        <w:rPr>
+          <w:rFonts w:ascii="Calibri" w:hAnsi="Calibri" w:eastAsia="Calibri"/>
+          <w:b w:val="0"/>
+          <w:i w:val="0"/>
+          <w:sz w:val="22"/>
+        </w:rPr>
+        <w:t>Daily branch dispatch sheet (Beaver Falls example dated Oct 5, 2026).</w:t>
+      </w:r>
+    </w:p>
+    <w:p>
+      <w:pPr>
+        <w:pStyle w:val="ListBullet"/>
+      </w:pPr>
+      <w:r>
+        <w:rPr>
+          <w:rFonts w:ascii="Calibri" w:hAnsi="Calibri" w:eastAsia="Calibri"/>
+          <w:b/>
+          <w:i w:val="0"/>
+          <w:sz w:val="22"/>
+        </w:rPr>
+        <w:t xml:space="preserve">Master Daily Jobs Dashboard — </w:t>
+      </w:r>
+      <w:r>
+        <w:rPr>
+          <w:rFonts w:ascii="Calibri" w:hAnsi="Calibri" w:eastAsia="Calibri"/>
+          <w:b w:val="0"/>
+          <w:i w:val="0"/>
+          <w:sz w:val="22"/>
+        </w:rPr>
+        <w:t>Job board with Required / Assignments / Unfilled / GSF.</w:t>
+      </w:r>
+    </w:p>
+    <w:p>
+      <w:pPr>
+        <w:pStyle w:val="Heading1"/>
+      </w:pPr>
+      <w:r>
+        <w:rPr>
+          <w:rFonts w:ascii="Calibri" w:hAnsi="Calibri" w:eastAsia="Calibri"/>
+          <w:b/>
+          <w:i w:val="0"/>
+          <w:color w:val="0D6E6E"/>
+          <w:sz w:val="32"/>
+        </w:rPr>
+        <w:t>3. The Requested mapping (previously missing)</w:t>
+      </w:r>
+    </w:p>
+    <w:p>
+      <w:pPr>
+        <w:pStyle w:val="ListBullet"/>
+      </w:pPr>
+      <w:r>
+        <w:rPr>
+          <w:rFonts w:ascii="Calibri" w:hAnsi="Calibri" w:eastAsia="Calibri"/>
+          <w:b/>
+          <w:i w:val="0"/>
+          <w:sz w:val="22"/>
+        </w:rPr>
+        <w:t>Roads Requested Resources</w:t>
       </w:r>
       <w:r>
         <w:rPr>
@@ -232,7 +217,7 @@
           <w:color w:val="1A2332"/>
           <w:sz w:val="22"/>
         </w:rPr>
-        <w:t>That Requested stack is the first data column in the Excel and is highlighted in green.</w:t>
+        <w:t>That stack is the first column in the Excel and is highlighted green.</w:t>
       </w:r>
     </w:p>
     <w:p>
@@ -247,108 +232,7 @@
           <w:color w:val="0D6E6E"/>
           <w:sz w:val="32"/>
         </w:rPr>
-        <w:t>3. How to read the Excel</w:t>
-      </w:r>
-    </w:p>
-    <w:p>
-      <w:pPr>
-        <w:spacing w:after="160"/>
-      </w:pPr>
-      <w:r>
-        <w:rPr>
-          <w:rFonts w:ascii="Calibri" w:hAnsi="Calibri" w:eastAsia="Calibri"/>
-          <w:b w:val="0"/>
-          <w:i w:val="0"/>
-          <w:color w:val="1A2332"/>
-          <w:sz w:val="22"/>
-        </w:rPr>
-        <w:t>Each vertical column is one matched field. Stacked top to bottom:</w:t>
-      </w:r>
-    </w:p>
-    <w:p>
-      <w:pPr>
-        <w:pStyle w:val="ListBullet"/>
-      </w:pPr>
-      <w:r>
-        <w:rPr>
-          <w:rFonts w:ascii="Calibri" w:hAnsi="Calibri" w:eastAsia="Calibri"/>
-          <w:b w:val="0"/>
-          <w:i w:val="0"/>
-          <w:sz w:val="22"/>
-        </w:rPr>
-        <w:t>Roads column (bold) + Roads formula (italic)</w:t>
-      </w:r>
-    </w:p>
-    <w:p>
-      <w:pPr>
-        <w:pStyle w:val="ListBullet"/>
-      </w:pPr>
-      <w:r>
-        <w:rPr>
-          <w:rFonts w:ascii="Calibri" w:hAnsi="Calibri" w:eastAsia="Calibri"/>
-          <w:b w:val="0"/>
-          <w:i w:val="0"/>
-          <w:sz w:val="22"/>
-        </w:rPr>
-        <w:t>cooresponding Onyx Column (bold) + Onyx formula (italic)</w:t>
-      </w:r>
-    </w:p>
-    <w:p>
-      <w:pPr>
-        <w:pStyle w:val="ListBullet"/>
-      </w:pPr>
-      <w:r>
-        <w:rPr>
-          <w:rFonts w:ascii="Calibri" w:hAnsi="Calibri" w:eastAsia="Calibri"/>
-          <w:b w:val="0"/>
-          <w:i w:val="0"/>
-          <w:sz w:val="22"/>
-        </w:rPr>
-        <w:t>Cooresponding Master Column (bold) + Master formula (italic)</w:t>
-      </w:r>
-    </w:p>
-    <w:p>
-      <w:pPr>
-        <w:spacing w:after="160"/>
-      </w:pPr>
-      <w:r>
-        <w:rPr>
-          <w:rFonts w:ascii="Calibri" w:hAnsi="Calibri" w:eastAsia="Calibri"/>
-          <w:b w:val="0"/>
-          <w:i w:val="0"/>
-          <w:color w:val="1A2332"/>
-          <w:sz w:val="22"/>
-        </w:rPr>
-        <w:t>Blank cell = no corresponding column in that view.</w:t>
-      </w:r>
-    </w:p>
-    <w:p>
-      <w:pPr>
-        <w:pStyle w:val="Heading1"/>
-      </w:pPr>
-      <w:r>
-        <w:rPr>
-          <w:rFonts w:ascii="Calibri" w:hAnsi="Calibri" w:eastAsia="Calibri"/>
-          <w:b/>
-          <w:i w:val="0"/>
-          <w:color w:val="0D6E6E"/>
-          <w:sz w:val="32"/>
-        </w:rPr>
-        <w:t>4. Other important staffing / ID mappings</w:t>
-      </w:r>
-    </w:p>
-    <w:p>
-      <w:pPr>
-        <w:pStyle w:val="ListBullet"/>
-      </w:pPr>
-      <w:r>
-        <w:rPr>
-          <w:rFonts w:ascii="Calibri" w:hAnsi="Calibri" w:eastAsia="Calibri"/>
-          <w:b w:val="0"/>
-          <w:i w:val="0"/>
-          <w:sz w:val="22"/>
-        </w:rPr>
-        <w:t>Roads Required Resources / On the Clock relate to Onyx Staff Requested/Sent and Master Required/Assignments.</w:t>
+        <w:t>4. Other key correspondences</w:t>
       </w:r>
     </w:p>
     <w:p>
@@ -376,7 +260,7 @@
           <w:i w:val="0"/>
           <w:sz w:val="22"/>
         </w:rPr>
-        <w:t>Master WO Number is different (customer work-order / EWO).</w:t>
+        <w:t>Master WO Number is a different customer work-order / EWO field.</w:t>
       </w:r>
     </w:p>
     <w:p>
@@ -390,7 +274,35 @@
           <w:i w:val="0"/>
           <w:sz w:val="22"/>
         </w:rPr>
-        <w:t>Onyx Total Saved = max(0, Requested − Sent). That is not the same as Master Unfilled.</w:t>
+        <w:t>Onyx Total Saved = max(0, Requested − Sent); that is not Master Unfilled.</w:t>
+      </w:r>
+    </w:p>
+    <w:p>
+      <w:pPr>
+        <w:pStyle w:val="ListBullet"/>
+      </w:pPr>
+      <w:r>
+        <w:rPr>
+          <w:rFonts w:ascii="Calibri" w:hAnsi="Calibri" w:eastAsia="Calibri"/>
+          <w:b w:val="0"/>
+          <w:i w:val="0"/>
+          <w:sz w:val="22"/>
+        </w:rPr>
+        <w:t>Onyx Ticket Type GSF ↔ Master GSF Yes/No.</w:t>
+      </w:r>
+    </w:p>
+    <w:p>
+      <w:pPr>
+        <w:pStyle w:val="ListBullet"/>
+      </w:pPr>
+      <w:r>
+        <w:rPr>
+          <w:rFonts w:ascii="Calibri" w:hAnsi="Calibri" w:eastAsia="Calibri"/>
+          <w:b w:val="0"/>
+          <w:i w:val="0"/>
+          <w:sz w:val="22"/>
+        </w:rPr>
+        <w:t>Onyx Branch ↔ Master Dispatching.</w:t>
       </w:r>
     </w:p>
     <w:p>
@@ -419,7 +331,7 @@
           <w:i w:val="0"/>
           <w:sz w:val="22"/>
         </w:rPr>
-        <w:t>Column Crosswalk — main stacked map (Requested highlighted).</w:t>
+        <w:t>Column Crosswalk — main stacked map</w:t>
       </w:r>
     </w:p>
     <w:p>
@@ -433,7 +345,7 @@
           <w:i w:val="0"/>
           <w:sz w:val="22"/>
         </w:rPr>
-        <w:t>Legend &amp; Notes — reading instructions and caveats.</w:t>
+        <w:t>Legend &amp; Notes — sources and caveats</w:t>
       </w:r>
     </w:p>
     <w:p>
@@ -447,7 +359,7 @@
           <w:i w:val="0"/>
           <w:sz w:val="22"/>
         </w:rPr>
-        <w:t>Stacked List (vertical) — same map for scrolling/printing.</w:t>
+        <w:t>Stacked List (vertical) — same map for printing</w:t>
       </w:r>
     </w:p>
     <w:p>
@@ -462,7 +374,7 @@
           <w:color w:val="0D6E6E"/>
           <w:sz w:val="32"/>
         </w:rPr>
-        <w:t>6. Note on Roads header text</w:t>
+        <w:t>6. Confidence note on Roads headers</w:t>
       </w:r>
     </w:p>
     <w:p>
@@ -477,19 +389,7 @@
           <w:color w:val="1A2332"/>
           <w:sz w:val="22"/>
         </w:rPr>
-        <w:t>The Roads export screenshot is low-resolution, so some Roads header labels were reconstructed from that export plus your confirmation that Requested is a Roads column. If any Roads heading in your live file uses slightly different wording, send the exact header name and it can be corrected.</w:t>
-      </w:r>
-    </w:p>
-    <w:p>
-      <w:r>
-        <w:rPr>
-          <w:rFonts w:ascii="Calibri" w:hAnsi="Calibri" w:eastAsia="Calibri"/>
-          <w:b w:val="0"/>
-          <w:i/>
-          <w:color w:val="5A6577"/>
-          <w:sz w:val="18"/>
-        </w:rPr>
-        <w:t>Companion file: Roads_Onyx_Master_Column_Crosswalk.xlsx</w:t>
+        <w:t>Onyx and Master headers are OCR-confirmed from clear screenshots. Roads right-side headers (HP/MP through Pay Rate) are from your clear header crop. Roads left/mid headers including Requested Resources come from the Roads Export screenshot you labeled; if any live export label differs, send the exact text and it will be corrected.</w:t>
       </w:r>
     </w:p>
     <w:sectPr>

</xml_diff>

<commit_message>
Refresh Roads headers from clearer export header view
Use Requested Resources / Required Resources / Assigned Employees and related
Roads export headers; keep Requested → Total Staff Requested → Required map.

Co-authored-by: echenry6f <echenry6f@users.noreply.github.com>
</commit_message>
<xml_diff>
--- a/Roads_Onyx_Master_Crosswalk_Guide.docx
+++ b/Roads_Onyx_Master_Crosswalk_Guide.docx
@@ -9,9 +9,9 @@
           <w:b/>
           <w:i w:val="0"/>
           <w:color w:val="1A2332"/>
-          <w:sz w:val="40"/>
+          <w:sz w:val="36"/>
         </w:rPr>
-        <w:t>Roads Export ↔ Onyx Report ↔ Master Dashboard</w:t>
+        <w:t>Roads Export ↔ Onyx ↔ Master — Crosswalk Guide</w:t>
       </w:r>
     </w:p>
     <w:p>
@@ -23,7 +23,7 @@
           <w:color w:val="5A6577"/>
           <w:sz w:val="22"/>
         </w:rPr>
-        <w:t>Guide to the rebuilt Excel crosswalk</w:t>
+        <w:t>Updated after clearer Roads Export header view.</w:t>
       </w:r>
     </w:p>
     <w:p>
@@ -36,123 +36,9 @@
           <w:b/>
           <w:i w:val="0"/>
           <w:color w:val="0D6E6E"/>
-          <w:sz w:val="32"/>
+          <w:sz w:val="28"/>
         </w:rPr>
-        <w:t>1. What this Excel shows</w:t>
-      </w:r>
-    </w:p>
-    <w:p>
-      <w:pPr>
-        <w:spacing w:after="160"/>
-      </w:pPr>
-      <w:r>
-        <w:rPr>
-          <w:rFonts w:ascii="Calibri" w:hAnsi="Calibri" w:eastAsia="Calibri"/>
-          <w:b w:val="0"/>
-          <w:i w:val="0"/>
-          <w:color w:val="1A2332"/>
-          <w:sz w:val="22"/>
-        </w:rPr>
-        <w:t>It maps corresponding columns across the three views you labeled, stacked the way you asked (Roads / Onyx / Master), with bold headings and italic formulas. Blank cells mean that view has no matching column.</w:t>
-      </w:r>
-    </w:p>
-    <w:p>
-      <w:pPr>
-        <w:pStyle w:val="Heading1"/>
-      </w:pPr>
-      <w:r>
-        <w:rPr>
-          <w:rFonts w:ascii="Calibri" w:hAnsi="Calibri" w:eastAsia="Calibri"/>
-          <w:b/>
-          <w:i w:val="0"/>
-          <w:color w:val="0D6E6E"/>
-          <w:sz w:val="32"/>
-        </w:rPr>
-        <w:t>2. The three sources</w:t>
-      </w:r>
-    </w:p>
-    <w:p>
-      <w:pPr>
-        <w:pStyle w:val="ListBullet"/>
-      </w:pPr>
-      <w:r>
-        <w:rPr>
-          <w:rFonts w:ascii="Calibri" w:hAnsi="Calibri" w:eastAsia="Calibri"/>
-          <w:b/>
-          <w:i w:val="0"/>
-          <w:sz w:val="22"/>
-        </w:rPr>
-        <w:t xml:space="preserve">Roads Export file — </w:t>
-      </w:r>
-      <w:r>
-        <w:rPr>
-          <w:rFonts w:ascii="Calibri" w:hAnsi="Calibri" w:eastAsia="Calibri"/>
-          <w:b w:val="0"/>
-          <w:i w:val="0"/>
-          <w:sz w:val="22"/>
-        </w:rPr>
-        <w:t>Wide export including Requested Resources and rate/certification fields.</w:t>
-      </w:r>
-    </w:p>
-    <w:p>
-      <w:pPr>
-        <w:pStyle w:val="ListBullet"/>
-      </w:pPr>
-      <w:r>
-        <w:rPr>
-          <w:rFonts w:ascii="Calibri" w:hAnsi="Calibri" w:eastAsia="Calibri"/>
-          <w:b/>
-          <w:i w:val="0"/>
-          <w:sz w:val="22"/>
-        </w:rPr>
-        <w:t xml:space="preserve">Onyx report — </w:t>
-      </w:r>
-      <w:r>
-        <w:rPr>
-          <w:rFonts w:ascii="Calibri" w:hAnsi="Calibri" w:eastAsia="Calibri"/>
-          <w:b w:val="0"/>
-          <w:i w:val="0"/>
-          <w:sz w:val="22"/>
-        </w:rPr>
-        <w:t>Daily branch dispatch sheet (Beaver Falls example dated Oct 5, 2026).</w:t>
-      </w:r>
-    </w:p>
-    <w:p>
-      <w:pPr>
-        <w:pStyle w:val="ListBullet"/>
-      </w:pPr>
-      <w:r>
-        <w:rPr>
-          <w:rFonts w:ascii="Calibri" w:hAnsi="Calibri" w:eastAsia="Calibri"/>
-          <w:b/>
-          <w:i w:val="0"/>
-          <w:sz w:val="22"/>
-        </w:rPr>
-        <w:t xml:space="preserve">Master Daily Jobs Dashboard — </w:t>
-      </w:r>
-      <w:r>
-        <w:rPr>
-          <w:rFonts w:ascii="Calibri" w:hAnsi="Calibri" w:eastAsia="Calibri"/>
-          <w:b w:val="0"/>
-          <w:i w:val="0"/>
-          <w:sz w:val="22"/>
-        </w:rPr>
-        <w:t>Job board with Required / Assignments / Unfilled / GSF.</w:t>
-      </w:r>
-    </w:p>
-    <w:p>
-      <w:pPr>
-        <w:pStyle w:val="Heading1"/>
-      </w:pPr>
-      <w:r>
-        <w:rPr>
-          <w:rFonts w:ascii="Calibri" w:hAnsi="Calibri" w:eastAsia="Calibri"/>
-          <w:b/>
-          <w:i w:val="0"/>
-          <w:color w:val="0D6E6E"/>
-          <w:sz w:val="32"/>
-        </w:rPr>
-        <w:t>3. The Requested mapping (previously missing)</w:t>
+        <w:t>Primary staffing map</w:t>
       </w:r>
     </w:p>
     <w:p>
@@ -207,17 +93,28 @@
     </w:p>
     <w:p>
       <w:pPr>
-        <w:spacing w:after="160"/>
+        <w:pStyle w:val="Heading1"/>
       </w:pPr>
+      <w:r>
+        <w:rPr>
+          <w:rFonts w:ascii="Calibri" w:hAnsi="Calibri" w:eastAsia="Calibri"/>
+          <w:b/>
+          <w:i w:val="0"/>
+          <w:color w:val="0D6E6E"/>
+          <w:sz w:val="28"/>
+        </w:rPr>
+        <w:t>What changed</w:t>
+      </w:r>
+    </w:p>
+    <w:p>
       <w:r>
         <w:rPr>
           <w:rFonts w:ascii="Calibri" w:hAnsi="Calibri" w:eastAsia="Calibri"/>
           <w:b w:val="0"/>
           <w:i w:val="0"/>
-          <w:color w:val="1A2332"/>
           <w:sz w:val="22"/>
         </w:rPr>
-        <w:t>That stack is the first column in the Excel and is highlighted green.</w:t>
+        <w:t>Roads columns were refreshed from your clearer header screenshot, including Requested Resources, Required Resources, Assigned Employees, Assignment Count, Job Number, Job Type, Job Location Name/Address, Assigned Equipment, PO # / Job #, and related fields. Onyx and Master mappings are unchanged.</w:t>
       </w:r>
     </w:p>
     <w:p>
@@ -230,15 +127,12 @@
           <w:b/>
           <w:i w:val="0"/>
           <w:color w:val="0D6E6E"/>
-          <w:sz w:val="32"/>
+          <w:sz w:val="28"/>
         </w:rPr>
-        <w:t>4. Other key correspondences</w:t>
+        <w:t>Download</w:t>
       </w:r>
     </w:p>
     <w:p>
-      <w:pPr>
-        <w:pStyle w:val="ListBullet"/>
-      </w:pPr>
       <w:r>
         <w:rPr>
           <w:rFonts w:ascii="Calibri" w:hAnsi="Calibri" w:eastAsia="Calibri"/>
@@ -246,150 +140,7 @@
           <w:i w:val="0"/>
           <w:sz w:val="22"/>
         </w:rPr>
-        <w:t>Master Job Number = Onyx Ticket # (same internal ID).</w:t>
-      </w:r>
-    </w:p>
-    <w:p>
-      <w:pPr>
-        <w:pStyle w:val="ListBullet"/>
-      </w:pPr>
-      <w:r>
-        <w:rPr>
-          <w:rFonts w:ascii="Calibri" w:hAnsi="Calibri" w:eastAsia="Calibri"/>
-          <w:b w:val="0"/>
-          <w:i w:val="0"/>
-          <w:sz w:val="22"/>
-        </w:rPr>
-        <w:t>Master WO Number is a different customer work-order / EWO field.</w:t>
-      </w:r>
-    </w:p>
-    <w:p>
-      <w:pPr>
-        <w:pStyle w:val="ListBullet"/>
-      </w:pPr>
-      <w:r>
-        <w:rPr>
-          <w:rFonts w:ascii="Calibri" w:hAnsi="Calibri" w:eastAsia="Calibri"/>
-          <w:b w:val="0"/>
-          <w:i w:val="0"/>
-          <w:sz w:val="22"/>
-        </w:rPr>
-        <w:t>Onyx Total Saved = max(0, Requested − Sent); that is not Master Unfilled.</w:t>
-      </w:r>
-    </w:p>
-    <w:p>
-      <w:pPr>
-        <w:pStyle w:val="ListBullet"/>
-      </w:pPr>
-      <w:r>
-        <w:rPr>
-          <w:rFonts w:ascii="Calibri" w:hAnsi="Calibri" w:eastAsia="Calibri"/>
-          <w:b w:val="0"/>
-          <w:i w:val="0"/>
-          <w:sz w:val="22"/>
-        </w:rPr>
-        <w:t>Onyx Ticket Type GSF ↔ Master GSF Yes/No.</w:t>
-      </w:r>
-    </w:p>
-    <w:p>
-      <w:pPr>
-        <w:pStyle w:val="ListBullet"/>
-      </w:pPr>
-      <w:r>
-        <w:rPr>
-          <w:rFonts w:ascii="Calibri" w:hAnsi="Calibri" w:eastAsia="Calibri"/>
-          <w:b w:val="0"/>
-          <w:i w:val="0"/>
-          <w:sz w:val="22"/>
-        </w:rPr>
-        <w:t>Onyx Branch ↔ Master Dispatching.</w:t>
-      </w:r>
-    </w:p>
-    <w:p>
-      <w:pPr>
-        <w:pStyle w:val="Heading1"/>
-      </w:pPr>
-      <w:r>
-        <w:rPr>
-          <w:rFonts w:ascii="Calibri" w:hAnsi="Calibri" w:eastAsia="Calibri"/>
-          <w:b/>
-          <w:i w:val="0"/>
-          <w:color w:val="0D6E6E"/>
-          <w:sz w:val="32"/>
-        </w:rPr>
-        <w:t>5. Workbook sheets</w:t>
-      </w:r>
-    </w:p>
-    <w:p>
-      <w:pPr>
-        <w:pStyle w:val="ListBullet"/>
-      </w:pPr>
-      <w:r>
-        <w:rPr>
-          <w:rFonts w:ascii="Calibri" w:hAnsi="Calibri" w:eastAsia="Calibri"/>
-          <w:b w:val="0"/>
-          <w:i w:val="0"/>
-          <w:sz w:val="22"/>
-        </w:rPr>
-        <w:t>Column Crosswalk — main stacked map</w:t>
-      </w:r>
-    </w:p>
-    <w:p>
-      <w:pPr>
-        <w:pStyle w:val="ListBullet"/>
-      </w:pPr>
-      <w:r>
-        <w:rPr>
-          <w:rFonts w:ascii="Calibri" w:hAnsi="Calibri" w:eastAsia="Calibri"/>
-          <w:b w:val="0"/>
-          <w:i w:val="0"/>
-          <w:sz w:val="22"/>
-        </w:rPr>
-        <w:t>Legend &amp; Notes — sources and caveats</w:t>
-      </w:r>
-    </w:p>
-    <w:p>
-      <w:pPr>
-        <w:pStyle w:val="ListBullet"/>
-      </w:pPr>
-      <w:r>
-        <w:rPr>
-          <w:rFonts w:ascii="Calibri" w:hAnsi="Calibri" w:eastAsia="Calibri"/>
-          <w:b w:val="0"/>
-          <w:i w:val="0"/>
-          <w:sz w:val="22"/>
-        </w:rPr>
-        <w:t>Stacked List (vertical) — same map for printing</w:t>
-      </w:r>
-    </w:p>
-    <w:p>
-      <w:pPr>
-        <w:pStyle w:val="Heading1"/>
-      </w:pPr>
-      <w:r>
-        <w:rPr>
-          <w:rFonts w:ascii="Calibri" w:hAnsi="Calibri" w:eastAsia="Calibri"/>
-          <w:b/>
-          <w:i w:val="0"/>
-          <w:color w:val="0D6E6E"/>
-          <w:sz w:val="32"/>
-        </w:rPr>
-        <w:t>6. Confidence note on Roads headers</w:t>
-      </w:r>
-    </w:p>
-    <w:p>
-      <w:pPr>
-        <w:spacing w:after="160"/>
-      </w:pPr>
-      <w:r>
-        <w:rPr>
-          <w:rFonts w:ascii="Calibri" w:hAnsi="Calibri" w:eastAsia="Calibri"/>
-          <w:b w:val="0"/>
-          <w:i w:val="0"/>
-          <w:color w:val="1A2332"/>
-          <w:sz w:val="22"/>
-        </w:rPr>
-        <w:t>Onyx and Master headers are OCR-confirmed from clear screenshots. Roads right-side headers (HP/MP through Pay Rate) are from your clear header crop. Roads left/mid headers including Requested Resources come from the Roads Export screenshot you labeled; if any live export label differs, send the exact text and it will be corrected.</w:t>
+        <w:t>Companion Excel: Roads_Onyx_Master_Column_Crosswalk.xlsx</w:t>
       </w:r>
     </w:p>
     <w:sectPr>

</xml_diff>

<commit_message>
Rebuild crosswalk from authentic Roads Export PDF headers
Use exact PDF columns including Requested Resources, Required Resources,
Unfilled Count, GSF AFAD, GSF Job, WO Number. Remove previously guessed
Roads headers not present in the PDF.

Co-authored-by: echenry6f <echenry6f@users.noreply.github.com>
</commit_message>
<xml_diff>
--- a/Roads_Onyx_Master_Crosswalk_Guide.docx
+++ b/Roads_Onyx_Master_Crosswalk_Guide.docx
@@ -11,7 +11,7 @@
           <w:color w:val="1A2332"/>
           <w:sz w:val="36"/>
         </w:rPr>
-        <w:t>Roads Export ↔ Onyx ↔ Master — Crosswalk Guide</w:t>
+        <w:t>Roads Export ↔ Onyx ↔ Master Crosswalk Guide</w:t>
       </w:r>
     </w:p>
     <w:p>
@@ -23,7 +23,7 @@
           <w:color w:val="5A6577"/>
           <w:sz w:val="22"/>
         </w:rPr>
-        <w:t>Updated after clearer Roads Export header view.</w:t>
+        <w:t>Rebuilt from the uploaded Roads Export PDF (exact column headers).</w:t>
       </w:r>
     </w:p>
     <w:p>
@@ -38,22 +38,10 @@
           <w:color w:val="0D6E6E"/>
           <w:sz w:val="28"/>
         </w:rPr>
-        <w:t>Primary staffing map</w:t>
+        <w:t>1. What changed</w:t>
       </w:r>
     </w:p>
     <w:p>
-      <w:pPr>
-        <w:pStyle w:val="ListBullet"/>
-      </w:pPr>
-      <w:r>
-        <w:rPr>
-          <w:rFonts w:ascii="Calibri" w:hAnsi="Calibri" w:eastAsia="Calibri"/>
-          <w:b/>
-          <w:i w:val="0"/>
-          <w:sz w:val="22"/>
-        </w:rPr>
-        <w:t>Roads Requested Resources</w:t>
-      </w:r>
       <w:r>
         <w:rPr>
           <w:rFonts w:ascii="Calibri" w:hAnsi="Calibri" w:eastAsia="Calibri"/>
@@ -61,34 +49,7 @@
           <w:i w:val="0"/>
           <w:sz w:val="22"/>
         </w:rPr>
-        <w:t xml:space="preserve"> → </w:t>
-      </w:r>
-      <w:r>
-        <w:rPr>
-          <w:rFonts w:ascii="Calibri" w:hAnsi="Calibri" w:eastAsia="Calibri"/>
-          <w:b/>
-          <w:i w:val="0"/>
-          <w:sz w:val="22"/>
-        </w:rPr>
-        <w:t>Onyx Total Staff Requested</w:t>
-      </w:r>
-      <w:r>
-        <w:rPr>
-          <w:rFonts w:ascii="Calibri" w:hAnsi="Calibri" w:eastAsia="Calibri"/>
-          <w:b w:val="0"/>
-          <w:i w:val="0"/>
-          <w:sz w:val="22"/>
-        </w:rPr>
-        <w:t xml:space="preserve"> → </w:t>
-      </w:r>
-      <w:r>
-        <w:rPr>
-          <w:rFonts w:ascii="Calibri" w:hAnsi="Calibri" w:eastAsia="Calibri"/>
-          <w:b/>
-          <w:i w:val="0"/>
-          <w:sz w:val="22"/>
-        </w:rPr>
-        <w:t>Master Required</w:t>
+        <w:t>Previous Roads headers were partly guessed from blurry screenshots. This version uses only the headers present in your Roads Export PDF.</w:t>
       </w:r>
     </w:p>
     <w:p>
@@ -103,10 +64,13 @@
           <w:color w:val="0D6E6E"/>
           <w:sz w:val="28"/>
         </w:rPr>
-        <w:t>What changed</w:t>
+        <w:t>2. Exact Roads Export columns (PDF order)</w:t>
       </w:r>
     </w:p>
     <w:p>
+      <w:pPr>
+        <w:pStyle w:val="ListBullet"/>
+      </w:pPr>
       <w:r>
         <w:rPr>
           <w:rFonts w:ascii="Calibri" w:hAnsi="Calibri" w:eastAsia="Calibri"/>
@@ -114,7 +78,385 @@
           <w:i w:val="0"/>
           <w:sz w:val="22"/>
         </w:rPr>
-        <w:t>Roads columns were refreshed from your clearer header screenshot, including Requested Resources, Required Resources, Assigned Employees, Assignment Count, Job Number, Job Type, Job Location Name/Address, Assigned Equipment, PO # / Job #, and related fields. Onyx and Master mappings are unchanged.</w:t>
+        <w:t>Customer</w:t>
+      </w:r>
+    </w:p>
+    <w:p>
+      <w:pPr>
+        <w:pStyle w:val="ListBullet"/>
+      </w:pPr>
+      <w:r>
+        <w:rPr>
+          <w:rFonts w:ascii="Calibri" w:hAnsi="Calibri" w:eastAsia="Calibri"/>
+          <w:b w:val="0"/>
+          <w:i w:val="0"/>
+          <w:sz w:val="22"/>
+        </w:rPr>
+        <w:t>Subcontractor</w:t>
+      </w:r>
+    </w:p>
+    <w:p>
+      <w:pPr>
+        <w:pStyle w:val="ListBullet"/>
+      </w:pPr>
+      <w:r>
+        <w:rPr>
+          <w:rFonts w:ascii="Calibri" w:hAnsi="Calibri" w:eastAsia="Calibri"/>
+          <w:b w:val="0"/>
+          <w:i w:val="0"/>
+          <w:sz w:val="22"/>
+        </w:rPr>
+        <w:t>Requested Resources</w:t>
+      </w:r>
+    </w:p>
+    <w:p>
+      <w:pPr>
+        <w:pStyle w:val="ListBullet"/>
+      </w:pPr>
+      <w:r>
+        <w:rPr>
+          <w:rFonts w:ascii="Calibri" w:hAnsi="Calibri" w:eastAsia="Calibri"/>
+          <w:b w:val="0"/>
+          <w:i w:val="0"/>
+          <w:sz w:val="22"/>
+        </w:rPr>
+        <w:t>Required Resources</w:t>
+      </w:r>
+    </w:p>
+    <w:p>
+      <w:pPr>
+        <w:pStyle w:val="ListBullet"/>
+      </w:pPr>
+      <w:r>
+        <w:rPr>
+          <w:rFonts w:ascii="Calibri" w:hAnsi="Calibri" w:eastAsia="Calibri"/>
+          <w:b w:val="0"/>
+          <w:i w:val="0"/>
+          <w:sz w:val="22"/>
+        </w:rPr>
+        <w:t>Unfilled Count</w:t>
+      </w:r>
+    </w:p>
+    <w:p>
+      <w:pPr>
+        <w:pStyle w:val="ListBullet"/>
+      </w:pPr>
+      <w:r>
+        <w:rPr>
+          <w:rFonts w:ascii="Calibri" w:hAnsi="Calibri" w:eastAsia="Calibri"/>
+          <w:b w:val="0"/>
+          <w:i w:val="0"/>
+          <w:sz w:val="22"/>
+        </w:rPr>
+        <w:t>Crew Lead</w:t>
+      </w:r>
+    </w:p>
+    <w:p>
+      <w:pPr>
+        <w:pStyle w:val="ListBullet"/>
+      </w:pPr>
+      <w:r>
+        <w:rPr>
+          <w:rFonts w:ascii="Calibri" w:hAnsi="Calibri" w:eastAsia="Calibri"/>
+          <w:b w:val="0"/>
+          <w:i w:val="0"/>
+          <w:sz w:val="22"/>
+        </w:rPr>
+        <w:t>Assigned Employees</w:t>
+      </w:r>
+    </w:p>
+    <w:p>
+      <w:pPr>
+        <w:pStyle w:val="ListBullet"/>
+      </w:pPr>
+      <w:r>
+        <w:rPr>
+          <w:rFonts w:ascii="Calibri" w:hAnsi="Calibri" w:eastAsia="Calibri"/>
+          <w:b w:val="0"/>
+          <w:i w:val="0"/>
+          <w:sz w:val="22"/>
+        </w:rPr>
+        <w:t>Assigned Equipment</w:t>
+      </w:r>
+    </w:p>
+    <w:p>
+      <w:pPr>
+        <w:pStyle w:val="ListBullet"/>
+      </w:pPr>
+      <w:r>
+        <w:rPr>
+          <w:rFonts w:ascii="Calibri" w:hAnsi="Calibri" w:eastAsia="Calibri"/>
+          <w:b w:val="0"/>
+          <w:i w:val="0"/>
+          <w:sz w:val="22"/>
+        </w:rPr>
+        <w:t>GSF AFAD</w:t>
+      </w:r>
+    </w:p>
+    <w:p>
+      <w:pPr>
+        <w:pStyle w:val="ListBullet"/>
+      </w:pPr>
+      <w:r>
+        <w:rPr>
+          <w:rFonts w:ascii="Calibri" w:hAnsi="Calibri" w:eastAsia="Calibri"/>
+          <w:b w:val="0"/>
+          <w:i w:val="0"/>
+          <w:sz w:val="22"/>
+        </w:rPr>
+        <w:t>Foreman</w:t>
+      </w:r>
+    </w:p>
+    <w:p>
+      <w:pPr>
+        <w:pStyle w:val="ListBullet"/>
+      </w:pPr>
+      <w:r>
+        <w:rPr>
+          <w:rFonts w:ascii="Calibri" w:hAnsi="Calibri" w:eastAsia="Calibri"/>
+          <w:b w:val="0"/>
+          <w:i w:val="0"/>
+          <w:sz w:val="22"/>
+        </w:rPr>
+        <w:t>Assignment Date</w:t>
+      </w:r>
+    </w:p>
+    <w:p>
+      <w:pPr>
+        <w:pStyle w:val="ListBullet"/>
+      </w:pPr>
+      <w:r>
+        <w:rPr>
+          <w:rFonts w:ascii="Calibri" w:hAnsi="Calibri" w:eastAsia="Calibri"/>
+          <w:b w:val="0"/>
+          <w:i w:val="0"/>
+          <w:sz w:val="22"/>
+        </w:rPr>
+        <w:t>Start Time</w:t>
+      </w:r>
+    </w:p>
+    <w:p>
+      <w:pPr>
+        <w:pStyle w:val="ListBullet"/>
+      </w:pPr>
+      <w:r>
+        <w:rPr>
+          <w:rFonts w:ascii="Calibri" w:hAnsi="Calibri" w:eastAsia="Calibri"/>
+          <w:b w:val="0"/>
+          <w:i w:val="0"/>
+          <w:sz w:val="22"/>
+        </w:rPr>
+        <w:t>Dispatching</w:t>
+      </w:r>
+    </w:p>
+    <w:p>
+      <w:pPr>
+        <w:pStyle w:val="ListBullet"/>
+      </w:pPr>
+      <w:r>
+        <w:rPr>
+          <w:rFonts w:ascii="Calibri" w:hAnsi="Calibri" w:eastAsia="Calibri"/>
+          <w:b w:val="0"/>
+          <w:i w:val="0"/>
+          <w:sz w:val="22"/>
+        </w:rPr>
+        <w:t>Job Number</w:t>
+      </w:r>
+    </w:p>
+    <w:p>
+      <w:pPr>
+        <w:pStyle w:val="ListBullet"/>
+      </w:pPr>
+      <w:r>
+        <w:rPr>
+          <w:rFonts w:ascii="Calibri" w:hAnsi="Calibri" w:eastAsia="Calibri"/>
+          <w:b w:val="0"/>
+          <w:i w:val="0"/>
+          <w:sz w:val="22"/>
+        </w:rPr>
+        <w:t>Job Location Name</w:t>
+      </w:r>
+    </w:p>
+    <w:p>
+      <w:pPr>
+        <w:pStyle w:val="ListBullet"/>
+      </w:pPr>
+      <w:r>
+        <w:rPr>
+          <w:rFonts w:ascii="Calibri" w:hAnsi="Calibri" w:eastAsia="Calibri"/>
+          <w:b w:val="0"/>
+          <w:i w:val="0"/>
+          <w:sz w:val="22"/>
+        </w:rPr>
+        <w:t>Job Location Address</w:t>
+      </w:r>
+    </w:p>
+    <w:p>
+      <w:pPr>
+        <w:pStyle w:val="ListBullet"/>
+      </w:pPr>
+      <w:r>
+        <w:rPr>
+          <w:rFonts w:ascii="Calibri" w:hAnsi="Calibri" w:eastAsia="Calibri"/>
+          <w:b w:val="0"/>
+          <w:i w:val="0"/>
+          <w:sz w:val="22"/>
+        </w:rPr>
+        <w:t>Job Type</w:t>
+      </w:r>
+    </w:p>
+    <w:p>
+      <w:pPr>
+        <w:pStyle w:val="ListBullet"/>
+      </w:pPr>
+      <w:r>
+        <w:rPr>
+          <w:rFonts w:ascii="Calibri" w:hAnsi="Calibri" w:eastAsia="Calibri"/>
+          <w:b w:val="0"/>
+          <w:i w:val="0"/>
+          <w:sz w:val="22"/>
+        </w:rPr>
+        <w:t>Assignment Count</w:t>
+      </w:r>
+    </w:p>
+    <w:p>
+      <w:pPr>
+        <w:pStyle w:val="ListBullet"/>
+      </w:pPr>
+      <w:r>
+        <w:rPr>
+          <w:rFonts w:ascii="Calibri" w:hAnsi="Calibri" w:eastAsia="Calibri"/>
+          <w:b w:val="0"/>
+          <w:i w:val="0"/>
+          <w:sz w:val="22"/>
+        </w:rPr>
+        <w:t>Completed Timesheets</w:t>
+      </w:r>
+    </w:p>
+    <w:p>
+      <w:pPr>
+        <w:pStyle w:val="ListBullet"/>
+      </w:pPr>
+      <w:r>
+        <w:rPr>
+          <w:rFonts w:ascii="Calibri" w:hAnsi="Calibri" w:eastAsia="Calibri"/>
+          <w:b w:val="0"/>
+          <w:i w:val="0"/>
+          <w:sz w:val="22"/>
+        </w:rPr>
+        <w:t>Total Timesheets</w:t>
+      </w:r>
+    </w:p>
+    <w:p>
+      <w:pPr>
+        <w:pStyle w:val="ListBullet"/>
+      </w:pPr>
+      <w:r>
+        <w:rPr>
+          <w:rFonts w:ascii="Calibri" w:hAnsi="Calibri" w:eastAsia="Calibri"/>
+          <w:b w:val="0"/>
+          <w:i w:val="0"/>
+          <w:sz w:val="22"/>
+        </w:rPr>
+        <w:t>Timesheets</w:t>
+      </w:r>
+    </w:p>
+    <w:p>
+      <w:pPr>
+        <w:pStyle w:val="ListBullet"/>
+      </w:pPr>
+      <w:r>
+        <w:rPr>
+          <w:rFonts w:ascii="Calibri" w:hAnsi="Calibri" w:eastAsia="Calibri"/>
+          <w:b w:val="0"/>
+          <w:i w:val="0"/>
+          <w:sz w:val="22"/>
+        </w:rPr>
+        <w:t>GSF Job</w:t>
+      </w:r>
+    </w:p>
+    <w:p>
+      <w:pPr>
+        <w:pStyle w:val="ListBullet"/>
+      </w:pPr>
+      <w:r>
+        <w:rPr>
+          <w:rFonts w:ascii="Calibri" w:hAnsi="Calibri" w:eastAsia="Calibri"/>
+          <w:b w:val="0"/>
+          <w:i w:val="0"/>
+          <w:sz w:val="22"/>
+        </w:rPr>
+        <w:t>GSF Operator</w:t>
+      </w:r>
+    </w:p>
+    <w:p>
+      <w:pPr>
+        <w:pStyle w:val="ListBullet"/>
+      </w:pPr>
+      <w:r>
+        <w:rPr>
+          <w:rFonts w:ascii="Calibri" w:hAnsi="Calibri" w:eastAsia="Calibri"/>
+          <w:b w:val="0"/>
+          <w:i w:val="0"/>
+          <w:sz w:val="22"/>
+        </w:rPr>
+        <w:t>Second GSF Operator</w:t>
+      </w:r>
+    </w:p>
+    <w:p>
+      <w:pPr>
+        <w:pStyle w:val="ListBullet"/>
+      </w:pPr>
+      <w:r>
+        <w:rPr>
+          <w:rFonts w:ascii="Calibri" w:hAnsi="Calibri" w:eastAsia="Calibri"/>
+          <w:b w:val="0"/>
+          <w:i w:val="0"/>
+          <w:sz w:val="22"/>
+        </w:rPr>
+        <w:t>Cancellation Count</w:t>
+      </w:r>
+    </w:p>
+    <w:p>
+      <w:pPr>
+        <w:pStyle w:val="ListBullet"/>
+      </w:pPr>
+      <w:r>
+        <w:rPr>
+          <w:rFonts w:ascii="Calibri" w:hAnsi="Calibri" w:eastAsia="Calibri"/>
+          <w:b w:val="0"/>
+          <w:i w:val="0"/>
+          <w:sz w:val="22"/>
+        </w:rPr>
+        <w:t>Cancellation Information</w:t>
+      </w:r>
+    </w:p>
+    <w:p>
+      <w:pPr>
+        <w:pStyle w:val="ListBullet"/>
+      </w:pPr>
+      <w:r>
+        <w:rPr>
+          <w:rFonts w:ascii="Calibri" w:hAnsi="Calibri" w:eastAsia="Calibri"/>
+          <w:b w:val="0"/>
+          <w:i w:val="0"/>
+          <w:sz w:val="22"/>
+        </w:rPr>
+        <w:t>WO Number</w:t>
+      </w:r>
+    </w:p>
+    <w:p>
+      <w:pPr>
+        <w:pStyle w:val="ListBullet"/>
+      </w:pPr>
+      <w:r>
+        <w:rPr>
+          <w:rFonts w:ascii="Calibri" w:hAnsi="Calibri" w:eastAsia="Calibri"/>
+          <w:b w:val="0"/>
+          <w:i w:val="0"/>
+          <w:sz w:val="22"/>
+        </w:rPr>
+        <w:t>Project Notes</w:t>
       </w:r>
     </w:p>
     <w:p>
@@ -129,10 +471,13 @@
           <w:color w:val="0D6E6E"/>
           <w:sz w:val="28"/>
         </w:rPr>
-        <w:t>Download</w:t>
+        <w:t>3. Primary staffing maps</w:t>
       </w:r>
     </w:p>
     <w:p>
+      <w:pPr>
+        <w:pStyle w:val="ListBullet"/>
+      </w:pPr>
       <w:r>
         <w:rPr>
           <w:rFonts w:ascii="Calibri" w:hAnsi="Calibri" w:eastAsia="Calibri"/>
@@ -140,7 +485,219 @@
           <w:i w:val="0"/>
           <w:sz w:val="22"/>
         </w:rPr>
-        <w:t>Companion Excel: Roads_Onyx_Master_Column_Crosswalk.xlsx</w:t>
+        <w:t>Roads Requested Resources → Onyx Total Staff Requested → Master Required (related)</w:t>
+      </w:r>
+    </w:p>
+    <w:p>
+      <w:pPr>
+        <w:pStyle w:val="ListBullet"/>
+      </w:pPr>
+      <w:r>
+        <w:rPr>
+          <w:rFonts w:ascii="Calibri" w:hAnsi="Calibri" w:eastAsia="Calibri"/>
+          <w:b w:val="0"/>
+          <w:i w:val="0"/>
+          <w:sz w:val="22"/>
+        </w:rPr>
+        <w:t>Roads Required Resources → Onyx Total Staff Requested / Master Required (best match on most rows in the PDF, where Requested Resources is often 0)</w:t>
+      </w:r>
+    </w:p>
+    <w:p>
+      <w:pPr>
+        <w:pStyle w:val="ListBullet"/>
+      </w:pPr>
+      <w:r>
+        <w:rPr>
+          <w:rFonts w:ascii="Calibri" w:hAnsi="Calibri" w:eastAsia="Calibri"/>
+          <w:b w:val="0"/>
+          <w:i w:val="0"/>
+          <w:sz w:val="22"/>
+        </w:rPr>
+        <w:t>Roads Assignment Count / Assigned Employees → Onyx Total Staff Sent / Master Assignments</w:t>
+      </w:r>
+    </w:p>
+    <w:p>
+      <w:pPr>
+        <w:pStyle w:val="ListBullet"/>
+      </w:pPr>
+      <w:r>
+        <w:rPr>
+          <w:rFonts w:ascii="Calibri" w:hAnsi="Calibri" w:eastAsia="Calibri"/>
+          <w:b w:val="0"/>
+          <w:i w:val="0"/>
+          <w:sz w:val="22"/>
+        </w:rPr>
+        <w:t>Roads Unfilled Count → Master Unfilled; Onyx Total Saved uses max(0, Requested−Sent) instead</w:t>
+      </w:r>
+    </w:p>
+    <w:p>
+      <w:pPr>
+        <w:pStyle w:val="Heading1"/>
+      </w:pPr>
+      <w:r>
+        <w:rPr>
+          <w:rFonts w:ascii="Calibri" w:hAnsi="Calibri" w:eastAsia="Calibri"/>
+          <w:b/>
+          <w:i w:val="0"/>
+          <w:color w:val="0D6E6E"/>
+          <w:sz w:val="28"/>
+        </w:rPr>
+        <w:t>4. Key identity maps</w:t>
+      </w:r>
+    </w:p>
+    <w:p>
+      <w:pPr>
+        <w:pStyle w:val="ListBullet"/>
+      </w:pPr>
+      <w:r>
+        <w:rPr>
+          <w:rFonts w:ascii="Calibri" w:hAnsi="Calibri" w:eastAsia="Calibri"/>
+          <w:b w:val="0"/>
+          <w:i w:val="0"/>
+          <w:sz w:val="22"/>
+        </w:rPr>
+        <w:t>Roads Job Number = Onyx Ticket # = Master Job Number</w:t>
+      </w:r>
+    </w:p>
+    <w:p>
+      <w:pPr>
+        <w:pStyle w:val="ListBullet"/>
+      </w:pPr>
+      <w:r>
+        <w:rPr>
+          <w:rFonts w:ascii="Calibri" w:hAnsi="Calibri" w:eastAsia="Calibri"/>
+          <w:b w:val="0"/>
+          <w:i w:val="0"/>
+          <w:sz w:val="22"/>
+        </w:rPr>
+        <w:t>Roads WO Number = Master WO Number</w:t>
+      </w:r>
+    </w:p>
+    <w:p>
+      <w:pPr>
+        <w:pStyle w:val="ListBullet"/>
+      </w:pPr>
+      <w:r>
+        <w:rPr>
+          <w:rFonts w:ascii="Calibri" w:hAnsi="Calibri" w:eastAsia="Calibri"/>
+          <w:b w:val="0"/>
+          <w:i w:val="0"/>
+          <w:sz w:val="22"/>
+        </w:rPr>
+        <w:t>Roads GSF Job ↔ Onyx Ticket Type GSF ↔ Master GSF</w:t>
+      </w:r>
+    </w:p>
+    <w:p>
+      <w:pPr>
+        <w:pStyle w:val="ListBullet"/>
+      </w:pPr>
+      <w:r>
+        <w:rPr>
+          <w:rFonts w:ascii="Calibri" w:hAnsi="Calibri" w:eastAsia="Calibri"/>
+          <w:b w:val="0"/>
+          <w:i w:val="0"/>
+          <w:sz w:val="22"/>
+        </w:rPr>
+        <w:t>Roads GSF AFAD (device list) ↔ Onyx AFAD Sent (count)</w:t>
+      </w:r>
+    </w:p>
+    <w:p>
+      <w:pPr>
+        <w:pStyle w:val="ListBullet"/>
+      </w:pPr>
+      <w:r>
+        <w:rPr>
+          <w:rFonts w:ascii="Calibri" w:hAnsi="Calibri" w:eastAsia="Calibri"/>
+          <w:b w:val="0"/>
+          <w:i w:val="0"/>
+          <w:sz w:val="22"/>
+        </w:rPr>
+        <w:t>Roads Dispatching = Onyx Branch = Master Dispatching</w:t>
+      </w:r>
+    </w:p>
+    <w:p>
+      <w:pPr>
+        <w:pStyle w:val="ListBullet"/>
+      </w:pPr>
+      <w:r>
+        <w:rPr>
+          <w:rFonts w:ascii="Calibri" w:hAnsi="Calibri" w:eastAsia="Calibri"/>
+          <w:b w:val="0"/>
+          <w:i w:val="0"/>
+          <w:sz w:val="22"/>
+        </w:rPr>
+        <w:t>Roads Crew Lead / Foreman = Master Crew Lead / Customer Foreman</w:t>
+      </w:r>
+    </w:p>
+    <w:p>
+      <w:pPr>
+        <w:pStyle w:val="Heading1"/>
+      </w:pPr>
+      <w:r>
+        <w:rPr>
+          <w:rFonts w:ascii="Calibri" w:hAnsi="Calibri" w:eastAsia="Calibri"/>
+          <w:b/>
+          <w:i w:val="0"/>
+          <w:color w:val="0D6E6E"/>
+          <w:sz w:val="28"/>
+        </w:rPr>
+        <w:t>5. Excel sheets</w:t>
+      </w:r>
+    </w:p>
+    <w:p>
+      <w:pPr>
+        <w:pStyle w:val="ListBullet"/>
+      </w:pPr>
+      <w:r>
+        <w:rPr>
+          <w:rFonts w:ascii="Calibri" w:hAnsi="Calibri" w:eastAsia="Calibri"/>
+          <w:b w:val="0"/>
+          <w:i w:val="0"/>
+          <w:sz w:val="22"/>
+        </w:rPr>
+        <w:t>Column Crosswalk</w:t>
+      </w:r>
+    </w:p>
+    <w:p>
+      <w:pPr>
+        <w:pStyle w:val="ListBullet"/>
+      </w:pPr>
+      <w:r>
+        <w:rPr>
+          <w:rFonts w:ascii="Calibri" w:hAnsi="Calibri" w:eastAsia="Calibri"/>
+          <w:b w:val="0"/>
+          <w:i w:val="0"/>
+          <w:sz w:val="22"/>
+        </w:rPr>
+        <w:t>Roads PDF Headers</w:t>
+      </w:r>
+    </w:p>
+    <w:p>
+      <w:pPr>
+        <w:pStyle w:val="ListBullet"/>
+      </w:pPr>
+      <w:r>
+        <w:rPr>
+          <w:rFonts w:ascii="Calibri" w:hAnsi="Calibri" w:eastAsia="Calibri"/>
+          <w:b w:val="0"/>
+          <w:i w:val="0"/>
+          <w:sz w:val="22"/>
+        </w:rPr>
+        <w:t>Legend &amp; Notes</w:t>
+      </w:r>
+    </w:p>
+    <w:p>
+      <w:pPr>
+        <w:pStyle w:val="ListBullet"/>
+      </w:pPr>
+      <w:r>
+        <w:rPr>
+          <w:rFonts w:ascii="Calibri" w:hAnsi="Calibri" w:eastAsia="Calibri"/>
+          <w:b w:val="0"/>
+          <w:i w:val="0"/>
+          <w:sz w:val="22"/>
+        </w:rPr>
+        <w:t>Stacked List (vertical)</w:t>
       </w:r>
     </w:p>
     <w:sectPr>

</xml_diff>

<commit_message>
Enforce one appearance per column; solo stacks when no true match
Stop double-mapping fields like Total Staff Requested or Required.
Pair only real correspondences; leave unmatched columns alone.

Co-authored-by: echenry6f <echenry6f@users.noreply.github.com>
</commit_message>
<xml_diff>
--- a/Roads_Onyx_Master_Crosswalk_Guide.docx
+++ b/Roads_Onyx_Master_Crosswalk_Guide.docx
@@ -11,7 +11,7 @@
           <w:color w:val="1A2332"/>
           <w:sz w:val="36"/>
         </w:rPr>
-        <w:t>Roads Export ↔ Onyx ↔ Master Crosswalk Guide</w:t>
+        <w:t>Column Crosswalk Guide (no repeated columns)</w:t>
       </w:r>
     </w:p>
     <w:p>
@@ -23,7 +23,7 @@
           <w:color w:val="5A6577"/>
           <w:sz w:val="22"/>
         </w:rPr>
-        <w:t>Rebuilt from the uploaded Roads Export PDF (exact column headers).</w:t>
+        <w:t>Each Roads, Onyx, and Master column name appears only once in the Excel file.</w:t>
       </w:r>
     </w:p>
     <w:p>
@@ -38,10 +38,13 @@
           <w:color w:val="0D6E6E"/>
           <w:sz w:val="28"/>
         </w:rPr>
-        <w:t>1. What changed</w:t>
+        <w:t>Rules</w:t>
       </w:r>
     </w:p>
     <w:p>
+      <w:pPr>
+        <w:pStyle w:val="ListBullet"/>
+      </w:pPr>
       <w:r>
         <w:rPr>
           <w:rFonts w:ascii="Calibri" w:hAnsi="Calibri" w:eastAsia="Calibri"/>
@@ -49,7 +52,35 @@
           <w:i w:val="0"/>
           <w:sz w:val="22"/>
         </w:rPr>
-        <w:t>Previous Roads headers were partly guessed from blurry screenshots. This version uses only the headers present in your Roads Export PDF.</w:t>
+        <w:t>Paired stacks = real correspondences across systems.</w:t>
+      </w:r>
+    </w:p>
+    <w:p>
+      <w:pPr>
+        <w:pStyle w:val="ListBullet"/>
+      </w:pPr>
+      <w:r>
+        <w:rPr>
+          <w:rFonts w:ascii="Calibri" w:hAnsi="Calibri" w:eastAsia="Calibri"/>
+          <w:b w:val="0"/>
+          <w:i w:val="0"/>
+          <w:sz w:val="22"/>
+        </w:rPr>
+        <w:t>SOLO columns = field has no twin; other rows in that stack are blank.</w:t>
+      </w:r>
+    </w:p>
+    <w:p>
+      <w:pPr>
+        <w:pStyle w:val="ListBullet"/>
+      </w:pPr>
+      <w:r>
+        <w:rPr>
+          <w:rFonts w:ascii="Calibri" w:hAnsi="Calibri" w:eastAsia="Calibri"/>
+          <w:b w:val="0"/>
+          <w:i w:val="0"/>
+          <w:sz w:val="22"/>
+        </w:rPr>
+        <w:t>No column heading is reused in a second Excel column.</w:t>
       </w:r>
     </w:p>
     <w:p>
@@ -64,7 +95,7 @@
           <w:color w:val="0D6E6E"/>
           <w:sz w:val="28"/>
         </w:rPr>
-        <w:t>2. Exact Roads Export columns (PDF order)</w:t>
+        <w:t>Staffing (deliberately not double-mapped)</w:t>
       </w:r>
     </w:p>
     <w:p>
@@ -78,7 +109,7 @@
           <w:i w:val="0"/>
           <w:sz w:val="22"/>
         </w:rPr>
-        <w:t>Customer</w:t>
+        <w:t>Requested Resources ↔ Total Staff Requested only</w:t>
       </w:r>
     </w:p>
     <w:p>
@@ -92,7 +123,7 @@
           <w:i w:val="0"/>
           <w:sz w:val="22"/>
         </w:rPr>
-        <w:t>Subcontractor</w:t>
+        <w:t>Required Resources ↔ Required only</w:t>
       </w:r>
     </w:p>
     <w:p>
@@ -106,7 +137,7 @@
           <w:i w:val="0"/>
           <w:sz w:val="22"/>
         </w:rPr>
-        <w:t>Requested Resources</w:t>
+        <w:t>Assignment Count ↔ Total Staff Sent ↔ Assignments</w:t>
       </w:r>
     </w:p>
     <w:p>
@@ -120,7 +151,7 @@
           <w:i w:val="0"/>
           <w:sz w:val="22"/>
         </w:rPr>
-        <w:t>Required Resources</w:t>
+        <w:t>Unfilled Count ↔ Unfilled only</w:t>
       </w:r>
     </w:p>
     <w:p>
@@ -134,329 +165,7 @@
           <w:i w:val="0"/>
           <w:sz w:val="22"/>
         </w:rPr>
-        <w:t>Unfilled Count</w:t>
-      </w:r>
-    </w:p>
-    <w:p>
-      <w:pPr>
-        <w:pStyle w:val="ListBullet"/>
-      </w:pPr>
-      <w:r>
-        <w:rPr>
-          <w:rFonts w:ascii="Calibri" w:hAnsi="Calibri" w:eastAsia="Calibri"/>
-          <w:b w:val="0"/>
-          <w:i w:val="0"/>
-          <w:sz w:val="22"/>
-        </w:rPr>
-        <w:t>Crew Lead</w:t>
-      </w:r>
-    </w:p>
-    <w:p>
-      <w:pPr>
-        <w:pStyle w:val="ListBullet"/>
-      </w:pPr>
-      <w:r>
-        <w:rPr>
-          <w:rFonts w:ascii="Calibri" w:hAnsi="Calibri" w:eastAsia="Calibri"/>
-          <w:b w:val="0"/>
-          <w:i w:val="0"/>
-          <w:sz w:val="22"/>
-        </w:rPr>
-        <w:t>Assigned Employees</w:t>
-      </w:r>
-    </w:p>
-    <w:p>
-      <w:pPr>
-        <w:pStyle w:val="ListBullet"/>
-      </w:pPr>
-      <w:r>
-        <w:rPr>
-          <w:rFonts w:ascii="Calibri" w:hAnsi="Calibri" w:eastAsia="Calibri"/>
-          <w:b w:val="0"/>
-          <w:i w:val="0"/>
-          <w:sz w:val="22"/>
-        </w:rPr>
-        <w:t>Assigned Equipment</w:t>
-      </w:r>
-    </w:p>
-    <w:p>
-      <w:pPr>
-        <w:pStyle w:val="ListBullet"/>
-      </w:pPr>
-      <w:r>
-        <w:rPr>
-          <w:rFonts w:ascii="Calibri" w:hAnsi="Calibri" w:eastAsia="Calibri"/>
-          <w:b w:val="0"/>
-          <w:i w:val="0"/>
-          <w:sz w:val="22"/>
-        </w:rPr>
-        <w:t>GSF AFAD</w:t>
-      </w:r>
-    </w:p>
-    <w:p>
-      <w:pPr>
-        <w:pStyle w:val="ListBullet"/>
-      </w:pPr>
-      <w:r>
-        <w:rPr>
-          <w:rFonts w:ascii="Calibri" w:hAnsi="Calibri" w:eastAsia="Calibri"/>
-          <w:b w:val="0"/>
-          <w:i w:val="0"/>
-          <w:sz w:val="22"/>
-        </w:rPr>
-        <w:t>Foreman</w:t>
-      </w:r>
-    </w:p>
-    <w:p>
-      <w:pPr>
-        <w:pStyle w:val="ListBullet"/>
-      </w:pPr>
-      <w:r>
-        <w:rPr>
-          <w:rFonts w:ascii="Calibri" w:hAnsi="Calibri" w:eastAsia="Calibri"/>
-          <w:b w:val="0"/>
-          <w:i w:val="0"/>
-          <w:sz w:val="22"/>
-        </w:rPr>
-        <w:t>Assignment Date</w:t>
-      </w:r>
-    </w:p>
-    <w:p>
-      <w:pPr>
-        <w:pStyle w:val="ListBullet"/>
-      </w:pPr>
-      <w:r>
-        <w:rPr>
-          <w:rFonts w:ascii="Calibri" w:hAnsi="Calibri" w:eastAsia="Calibri"/>
-          <w:b w:val="0"/>
-          <w:i w:val="0"/>
-          <w:sz w:val="22"/>
-        </w:rPr>
-        <w:t>Start Time</w:t>
-      </w:r>
-    </w:p>
-    <w:p>
-      <w:pPr>
-        <w:pStyle w:val="ListBullet"/>
-      </w:pPr>
-      <w:r>
-        <w:rPr>
-          <w:rFonts w:ascii="Calibri" w:hAnsi="Calibri" w:eastAsia="Calibri"/>
-          <w:b w:val="0"/>
-          <w:i w:val="0"/>
-          <w:sz w:val="22"/>
-        </w:rPr>
-        <w:t>Dispatching</w:t>
-      </w:r>
-    </w:p>
-    <w:p>
-      <w:pPr>
-        <w:pStyle w:val="ListBullet"/>
-      </w:pPr>
-      <w:r>
-        <w:rPr>
-          <w:rFonts w:ascii="Calibri" w:hAnsi="Calibri" w:eastAsia="Calibri"/>
-          <w:b w:val="0"/>
-          <w:i w:val="0"/>
-          <w:sz w:val="22"/>
-        </w:rPr>
-        <w:t>Job Number</w:t>
-      </w:r>
-    </w:p>
-    <w:p>
-      <w:pPr>
-        <w:pStyle w:val="ListBullet"/>
-      </w:pPr>
-      <w:r>
-        <w:rPr>
-          <w:rFonts w:ascii="Calibri" w:hAnsi="Calibri" w:eastAsia="Calibri"/>
-          <w:b w:val="0"/>
-          <w:i w:val="0"/>
-          <w:sz w:val="22"/>
-        </w:rPr>
-        <w:t>Job Location Name</w:t>
-      </w:r>
-    </w:p>
-    <w:p>
-      <w:pPr>
-        <w:pStyle w:val="ListBullet"/>
-      </w:pPr>
-      <w:r>
-        <w:rPr>
-          <w:rFonts w:ascii="Calibri" w:hAnsi="Calibri" w:eastAsia="Calibri"/>
-          <w:b w:val="0"/>
-          <w:i w:val="0"/>
-          <w:sz w:val="22"/>
-        </w:rPr>
-        <w:t>Job Location Address</w:t>
-      </w:r>
-    </w:p>
-    <w:p>
-      <w:pPr>
-        <w:pStyle w:val="ListBullet"/>
-      </w:pPr>
-      <w:r>
-        <w:rPr>
-          <w:rFonts w:ascii="Calibri" w:hAnsi="Calibri" w:eastAsia="Calibri"/>
-          <w:b w:val="0"/>
-          <w:i w:val="0"/>
-          <w:sz w:val="22"/>
-        </w:rPr>
-        <w:t>Job Type</w:t>
-      </w:r>
-    </w:p>
-    <w:p>
-      <w:pPr>
-        <w:pStyle w:val="ListBullet"/>
-      </w:pPr>
-      <w:r>
-        <w:rPr>
-          <w:rFonts w:ascii="Calibri" w:hAnsi="Calibri" w:eastAsia="Calibri"/>
-          <w:b w:val="0"/>
-          <w:i w:val="0"/>
-          <w:sz w:val="22"/>
-        </w:rPr>
-        <w:t>Assignment Count</w:t>
-      </w:r>
-    </w:p>
-    <w:p>
-      <w:pPr>
-        <w:pStyle w:val="ListBullet"/>
-      </w:pPr>
-      <w:r>
-        <w:rPr>
-          <w:rFonts w:ascii="Calibri" w:hAnsi="Calibri" w:eastAsia="Calibri"/>
-          <w:b w:val="0"/>
-          <w:i w:val="0"/>
-          <w:sz w:val="22"/>
-        </w:rPr>
-        <w:t>Completed Timesheets</w:t>
-      </w:r>
-    </w:p>
-    <w:p>
-      <w:pPr>
-        <w:pStyle w:val="ListBullet"/>
-      </w:pPr>
-      <w:r>
-        <w:rPr>
-          <w:rFonts w:ascii="Calibri" w:hAnsi="Calibri" w:eastAsia="Calibri"/>
-          <w:b w:val="0"/>
-          <w:i w:val="0"/>
-          <w:sz w:val="22"/>
-        </w:rPr>
-        <w:t>Total Timesheets</w:t>
-      </w:r>
-    </w:p>
-    <w:p>
-      <w:pPr>
-        <w:pStyle w:val="ListBullet"/>
-      </w:pPr>
-      <w:r>
-        <w:rPr>
-          <w:rFonts w:ascii="Calibri" w:hAnsi="Calibri" w:eastAsia="Calibri"/>
-          <w:b w:val="0"/>
-          <w:i w:val="0"/>
-          <w:sz w:val="22"/>
-        </w:rPr>
-        <w:t>Timesheets</w:t>
-      </w:r>
-    </w:p>
-    <w:p>
-      <w:pPr>
-        <w:pStyle w:val="ListBullet"/>
-      </w:pPr>
-      <w:r>
-        <w:rPr>
-          <w:rFonts w:ascii="Calibri" w:hAnsi="Calibri" w:eastAsia="Calibri"/>
-          <w:b w:val="0"/>
-          <w:i w:val="0"/>
-          <w:sz w:val="22"/>
-        </w:rPr>
-        <w:t>GSF Job</w:t>
-      </w:r>
-    </w:p>
-    <w:p>
-      <w:pPr>
-        <w:pStyle w:val="ListBullet"/>
-      </w:pPr>
-      <w:r>
-        <w:rPr>
-          <w:rFonts w:ascii="Calibri" w:hAnsi="Calibri" w:eastAsia="Calibri"/>
-          <w:b w:val="0"/>
-          <w:i w:val="0"/>
-          <w:sz w:val="22"/>
-        </w:rPr>
-        <w:t>GSF Operator</w:t>
-      </w:r>
-    </w:p>
-    <w:p>
-      <w:pPr>
-        <w:pStyle w:val="ListBullet"/>
-      </w:pPr>
-      <w:r>
-        <w:rPr>
-          <w:rFonts w:ascii="Calibri" w:hAnsi="Calibri" w:eastAsia="Calibri"/>
-          <w:b w:val="0"/>
-          <w:i w:val="0"/>
-          <w:sz w:val="22"/>
-        </w:rPr>
-        <w:t>Second GSF Operator</w:t>
-      </w:r>
-    </w:p>
-    <w:p>
-      <w:pPr>
-        <w:pStyle w:val="ListBullet"/>
-      </w:pPr>
-      <w:r>
-        <w:rPr>
-          <w:rFonts w:ascii="Calibri" w:hAnsi="Calibri" w:eastAsia="Calibri"/>
-          <w:b w:val="0"/>
-          <w:i w:val="0"/>
-          <w:sz w:val="22"/>
-        </w:rPr>
-        <w:t>Cancellation Count</w:t>
-      </w:r>
-    </w:p>
-    <w:p>
-      <w:pPr>
-        <w:pStyle w:val="ListBullet"/>
-      </w:pPr>
-      <w:r>
-        <w:rPr>
-          <w:rFonts w:ascii="Calibri" w:hAnsi="Calibri" w:eastAsia="Calibri"/>
-          <w:b w:val="0"/>
-          <w:i w:val="0"/>
-          <w:sz w:val="22"/>
-        </w:rPr>
-        <w:t>Cancellation Information</w:t>
-      </w:r>
-    </w:p>
-    <w:p>
-      <w:pPr>
-        <w:pStyle w:val="ListBullet"/>
-      </w:pPr>
-      <w:r>
-        <w:rPr>
-          <w:rFonts w:ascii="Calibri" w:hAnsi="Calibri" w:eastAsia="Calibri"/>
-          <w:b w:val="0"/>
-          <w:i w:val="0"/>
-          <w:sz w:val="22"/>
-        </w:rPr>
-        <w:t>WO Number</w:t>
-      </w:r>
-    </w:p>
-    <w:p>
-      <w:pPr>
-        <w:pStyle w:val="ListBullet"/>
-      </w:pPr>
-      <w:r>
-        <w:rPr>
-          <w:rFonts w:ascii="Calibri" w:hAnsi="Calibri" w:eastAsia="Calibri"/>
-          <w:b w:val="0"/>
-          <w:i w:val="0"/>
-          <w:sz w:val="22"/>
-        </w:rPr>
-        <w:t>Project Notes</w:t>
+        <w:t>Total Saved stands alone (different formula from Unfilled)</w:t>
       </w:r>
     </w:p>
     <w:p>
@@ -471,7 +180,7 @@
           <w:color w:val="0D6E6E"/>
           <w:sz w:val="28"/>
         </w:rPr>
-        <w:t>3. Primary staffing maps</w:t>
+        <w:t>Other important pairs</w:t>
       </w:r>
     </w:p>
     <w:p>
@@ -485,7 +194,7 @@
           <w:i w:val="0"/>
           <w:sz w:val="22"/>
         </w:rPr>
-        <w:t>Roads Requested Resources → Onyx Total Staff Requested → Master Required (related)</w:t>
+        <w:t>Job Number ↔ Ticket # ↔ Job Number</w:t>
       </w:r>
     </w:p>
     <w:p>
@@ -499,7 +208,7 @@
           <w:i w:val="0"/>
           <w:sz w:val="22"/>
         </w:rPr>
-        <w:t>Roads Required Resources → Onyx Total Staff Requested / Master Required (best match on most rows in the PDF, where Requested Resources is often 0)</w:t>
+        <w:t>GSF Job ↔ Ticket Type ↔ GSF</w:t>
       </w:r>
     </w:p>
     <w:p>
@@ -513,7 +222,7 @@
           <w:i w:val="0"/>
           <w:sz w:val="22"/>
         </w:rPr>
-        <w:t>Roads Assignment Count / Assigned Employees → Onyx Total Staff Sent / Master Assignments</w:t>
+        <w:t>GSF AFAD ↔ AFAD Sent</w:t>
       </w:r>
     </w:p>
     <w:p>
@@ -527,22 +236,7 @@
           <w:i w:val="0"/>
           <w:sz w:val="22"/>
         </w:rPr>
-        <w:t>Roads Unfilled Count → Master Unfilled; Onyx Total Saved uses max(0, Requested−Sent) instead</w:t>
-      </w:r>
-    </w:p>
-    <w:p>
-      <w:pPr>
-        <w:pStyle w:val="Heading1"/>
-      </w:pPr>
-      <w:r>
-        <w:rPr>
-          <w:rFonts w:ascii="Calibri" w:hAnsi="Calibri" w:eastAsia="Calibri"/>
-          <w:b/>
-          <w:i w:val="0"/>
-          <w:color w:val="0D6E6E"/>
-          <w:sz w:val="28"/>
-        </w:rPr>
-        <w:t>4. Key identity maps</w:t>
+        <w:t>Dispatching ↔ Branch ↔ Dispatching</w:t>
       </w:r>
     </w:p>
     <w:p>
@@ -556,7 +250,7 @@
           <w:i w:val="0"/>
           <w:sz w:val="22"/>
         </w:rPr>
-        <w:t>Roads Job Number = Onyx Ticket # = Master Job Number</w:t>
+        <w:t>Job Location Name ↔ Location ↔ Job Location (Address is Roads-only)</w:t>
       </w:r>
     </w:p>
     <w:p>
@@ -570,134 +264,7 @@
           <w:i w:val="0"/>
           <w:sz w:val="22"/>
         </w:rPr>
-        <w:t>Roads WO Number = Master WO Number</w:t>
-      </w:r>
-    </w:p>
-    <w:p>
-      <w:pPr>
-        <w:pStyle w:val="ListBullet"/>
-      </w:pPr>
-      <w:r>
-        <w:rPr>
-          <w:rFonts w:ascii="Calibri" w:hAnsi="Calibri" w:eastAsia="Calibri"/>
-          <w:b w:val="0"/>
-          <w:i w:val="0"/>
-          <w:sz w:val="22"/>
-        </w:rPr>
-        <w:t>Roads GSF Job ↔ Onyx Ticket Type GSF ↔ Master GSF</w:t>
-      </w:r>
-    </w:p>
-    <w:p>
-      <w:pPr>
-        <w:pStyle w:val="ListBullet"/>
-      </w:pPr>
-      <w:r>
-        <w:rPr>
-          <w:rFonts w:ascii="Calibri" w:hAnsi="Calibri" w:eastAsia="Calibri"/>
-          <w:b w:val="0"/>
-          <w:i w:val="0"/>
-          <w:sz w:val="22"/>
-        </w:rPr>
-        <w:t>Roads GSF AFAD (device list) ↔ Onyx AFAD Sent (count)</w:t>
-      </w:r>
-    </w:p>
-    <w:p>
-      <w:pPr>
-        <w:pStyle w:val="ListBullet"/>
-      </w:pPr>
-      <w:r>
-        <w:rPr>
-          <w:rFonts w:ascii="Calibri" w:hAnsi="Calibri" w:eastAsia="Calibri"/>
-          <w:b w:val="0"/>
-          <w:i w:val="0"/>
-          <w:sz w:val="22"/>
-        </w:rPr>
-        <w:t>Roads Dispatching = Onyx Branch = Master Dispatching</w:t>
-      </w:r>
-    </w:p>
-    <w:p>
-      <w:pPr>
-        <w:pStyle w:val="ListBullet"/>
-      </w:pPr>
-      <w:r>
-        <w:rPr>
-          <w:rFonts w:ascii="Calibri" w:hAnsi="Calibri" w:eastAsia="Calibri"/>
-          <w:b w:val="0"/>
-          <w:i w:val="0"/>
-          <w:sz w:val="22"/>
-        </w:rPr>
-        <w:t>Roads Crew Lead / Foreman = Master Crew Lead / Customer Foreman</w:t>
-      </w:r>
-    </w:p>
-    <w:p>
-      <w:pPr>
-        <w:pStyle w:val="Heading1"/>
-      </w:pPr>
-      <w:r>
-        <w:rPr>
-          <w:rFonts w:ascii="Calibri" w:hAnsi="Calibri" w:eastAsia="Calibri"/>
-          <w:b/>
-          <w:i w:val="0"/>
-          <w:color w:val="0D6E6E"/>
-          <w:sz w:val="28"/>
-        </w:rPr>
-        <w:t>5. Excel sheets</w:t>
-      </w:r>
-    </w:p>
-    <w:p>
-      <w:pPr>
-        <w:pStyle w:val="ListBullet"/>
-      </w:pPr>
-      <w:r>
-        <w:rPr>
-          <w:rFonts w:ascii="Calibri" w:hAnsi="Calibri" w:eastAsia="Calibri"/>
-          <w:b w:val="0"/>
-          <w:i w:val="0"/>
-          <w:sz w:val="22"/>
-        </w:rPr>
-        <w:t>Column Crosswalk</w:t>
-      </w:r>
-    </w:p>
-    <w:p>
-      <w:pPr>
-        <w:pStyle w:val="ListBullet"/>
-      </w:pPr>
-      <w:r>
-        <w:rPr>
-          <w:rFonts w:ascii="Calibri" w:hAnsi="Calibri" w:eastAsia="Calibri"/>
-          <w:b w:val="0"/>
-          <w:i w:val="0"/>
-          <w:sz w:val="22"/>
-        </w:rPr>
-        <w:t>Roads PDF Headers</w:t>
-      </w:r>
-    </w:p>
-    <w:p>
-      <w:pPr>
-        <w:pStyle w:val="ListBullet"/>
-      </w:pPr>
-      <w:r>
-        <w:rPr>
-          <w:rFonts w:ascii="Calibri" w:hAnsi="Calibri" w:eastAsia="Calibri"/>
-          <w:b w:val="0"/>
-          <w:i w:val="0"/>
-          <w:sz w:val="22"/>
-        </w:rPr>
-        <w:t>Legend &amp; Notes</w:t>
-      </w:r>
-    </w:p>
-    <w:p>
-      <w:pPr>
-        <w:pStyle w:val="ListBullet"/>
-      </w:pPr>
-      <w:r>
-        <w:rPr>
-          <w:rFonts w:ascii="Calibri" w:hAnsi="Calibri" w:eastAsia="Calibri"/>
-          <w:b w:val="0"/>
-          <w:i w:val="0"/>
-          <w:sz w:val="22"/>
-        </w:rPr>
-        <w:t>Stacked List (vertical)</w:t>
+        <w:t>Timesheets ↔ Notes (Project Notes is Roads-only)</w:t>
       </w:r>
     </w:p>
     <w:sectPr>

</xml_diff>